<commit_message>
Retitle: manuscript subtitle 'A Monte Carlo Evaluation...', formal title atop README, repo name comparing-improper-payment-estimators in links
Co-Authored-By: Claude Opus 5.5 <noreply@anthropic.com>
Claude-Session: https://claude.ai/code/session_01FT6WTZJtFYxxeWDSEVdy7M
</commit_message>
<xml_diff>
--- a/manuscripts/manuscript.docx
+++ b/manuscripts/manuscript.docx
@@ -91,7 +91,7 @@
         <w:t xml:space="preserve"> </w:t>
       </w:r>
       <w:r>
-        <w:t xml:space="preserve">Study</w:t>
+        <w:t xml:space="preserve">Evaluation</w:t>
       </w:r>
       <w:r>
         <w:t xml:space="preserve"> </w:t>
@@ -10749,7 +10749,7 @@
           <w:rPr>
             <w:rStyle w:val="Hyperlink"/>
           </w:rPr>
-          <w:t xml:space="preserve">andrewcistola/bootstrap-simulation-in-health-plan-payment-integrity</w:t>
+          <w:t xml:space="preserve">andrewcistola/comparing-improper-payment-estimators</w:t>
         </w:r>
       </w:hyperlink>
       <w:r>

</xml_diff>

<commit_message>
Literature review as a standalone paper aligned with the manuscript; file renamed to match the repo
- Renamed to literature-review/comparing-improper-payment-estimators-literature-review.md
- Title, abstract, introduction, review approach, numbered sections, conclusions
- Same research question and accuracy definitions as the manuscript
- CERT added as a full program (design, FY 2025 results, fit, scenario grid);
  EIPM updated (no underpayments, technically improper, margin of error)
- Audit-finding simulation defined (fixed vs parametric rates)
- Internal checklist replaced by data and access needs; 66 annotated references
- PDF, Word and HTML renders; manuscript cites the companion review

Co-Authored-By: Claude Opus 5.5 <noreply@anthropic.com>
Claude-Session: https://claude.ai/code/session_01FT6WTZJtFYxxeWDSEVdy7M
</commit_message>
<xml_diff>
--- a/manuscripts/manuscript.docx
+++ b/manuscripts/manuscript.docx
@@ -738,7 +738,7 @@
         <w:pStyle w:val="FirstParagraph"/>
       </w:pPr>
       <w:r>
-        <w:t xml:space="preserve">To our knowledge, the comparative accuracy of these methods, and in particular the validity of the simulation’s intervals, has not been tested against a known truth.</w:t>
+        <w:t xml:space="preserve">To our knowledge, the comparative accuracy of these methods, and in particular the validity of the simulation’s intervals, has not been tested against a known truth. A companion narrative review sets out each program’s design and the evidence on interval accuracy in detail (Cistola 2026).</w:t>
       </w:r>
     </w:p>
     <w:bookmarkEnd w:id="22"/>
@@ -793,35 +793,47 @@
       <w:r>
         <w:t xml:space="preserve">The methods are:</w:t>
       </w:r>
-      <w:r>
-        <w:t xml:space="preserve"> </w:t>
-      </w:r>
-      <w:r>
-        <w:t xml:space="preserve">- the three design-based analytic estimators in use (expansion, ratio and regression);</w:t>
-      </w:r>
-      <w:r>
-        <w:t xml:space="preserve"> </w:t>
-      </w:r>
-      <w:r>
-        <w:t xml:space="preserve">- audit-finding bootstrap simulation.</w:t>
-      </w:r>
-    </w:p>
-    <w:p>
-      <w:pPr>
-        <w:pStyle w:val="BodyText"/>
+    </w:p>
+    <w:p>
+      <w:pPr>
+        <w:numPr>
+          <w:ilvl w:val="0"/>
+          <w:numId w:val="1005"/>
+        </w:numPr>
+        <w:pStyle w:val="Compact"/>
+      </w:pPr>
+      <w:r>
+        <w:t xml:space="preserve">the three design-based analytic estimators in use (expansion, ratio and regression);</w:t>
+      </w:r>
+    </w:p>
+    <w:p>
+      <w:pPr>
+        <w:numPr>
+          <w:ilvl w:val="0"/>
+          <w:numId w:val="1005"/>
+        </w:numPr>
+        <w:pStyle w:val="Compact"/>
+      </w:pPr>
+      <w:r>
+        <w:t xml:space="preserve">audit-finding bootstrap simulation.</w:t>
+      </w:r>
+    </w:p>
+    <w:p>
+      <w:pPr>
+        <w:pStyle w:val="FirstParagraph"/>
       </w:pPr>
       <w:r>
         <w:t xml:space="preserve">Accuracy has two parts:</w:t>
       </w:r>
-      <w:r>
-        <w:t xml:space="preserve"> </w:t>
-      </w:r>
-      <w:r>
-        <w:t xml:space="preserve">-</w:t>
-      </w:r>
-      <w:r>
-        <w:t xml:space="preserve"> </w:t>
-      </w:r>
+    </w:p>
+    <w:p>
+      <w:pPr>
+        <w:numPr>
+          <w:ilvl w:val="0"/>
+          <w:numId w:val="1006"/>
+        </w:numPr>
+        <w:pStyle w:val="Compact"/>
+      </w:pPr>
       <w:r>
         <w:rPr>
           <w:bCs/>
@@ -835,15 +847,15 @@
       <w:r>
         <w:t xml:space="preserve">how close the point estimate is to the true improper payment.</w:t>
       </w:r>
-      <w:r>
-        <w:t xml:space="preserve"> </w:t>
-      </w:r>
-      <w:r>
-        <w:t xml:space="preserve">-</w:t>
-      </w:r>
-      <w:r>
-        <w:t xml:space="preserve"> </w:t>
-      </w:r>
+    </w:p>
+    <w:p>
+      <w:pPr>
+        <w:numPr>
+          <w:ilvl w:val="0"/>
+          <w:numId w:val="1006"/>
+        </w:numPr>
+        <w:pStyle w:val="Compact"/>
+      </w:pPr>
       <w:r>
         <w:rPr>
           <w:bCs/>
@@ -860,7 +872,7 @@
     </w:p>
     <w:p>
       <w:pPr>
-        <w:pStyle w:val="BodyText"/>
+        <w:pStyle w:val="FirstParagraph"/>
       </w:pPr>
       <w:r>
         <w:t xml:space="preserve">The specific aims are to:</w:t>
@@ -870,7 +882,7 @@
       <w:pPr>
         <w:numPr>
           <w:ilvl w:val="0"/>
-          <w:numId w:val="1005"/>
+          <w:numId w:val="1007"/>
         </w:numPr>
         <w:pStyle w:val="Compact"/>
       </w:pPr>
@@ -882,7 +894,7 @@
       <w:pPr>
         <w:numPr>
           <w:ilvl w:val="0"/>
-          <w:numId w:val="1005"/>
+          <w:numId w:val="1007"/>
         </w:numPr>
         <w:pStyle w:val="Compact"/>
       </w:pPr>
@@ -894,7 +906,7 @@
       <w:pPr>
         <w:numPr>
           <w:ilvl w:val="0"/>
-          <w:numId w:val="1005"/>
+          <w:numId w:val="1007"/>
         </w:numPr>
         <w:pStyle w:val="Compact"/>
       </w:pPr>
@@ -906,7 +918,7 @@
       <w:pPr>
         <w:numPr>
           <w:ilvl w:val="0"/>
-          <w:numId w:val="1005"/>
+          <w:numId w:val="1007"/>
         </w:numPr>
         <w:pStyle w:val="Compact"/>
       </w:pPr>
@@ -953,7 +965,7 @@
       <w:pPr>
         <w:numPr>
           <w:ilvl w:val="0"/>
-          <w:numId w:val="1006"/>
+          <w:numId w:val="1008"/>
         </w:numPr>
         <w:pStyle w:val="Compact"/>
       </w:pPr>
@@ -975,7 +987,7 @@
       <w:pPr>
         <w:numPr>
           <w:ilvl w:val="0"/>
-          <w:numId w:val="1006"/>
+          <w:numId w:val="1008"/>
         </w:numPr>
         <w:pStyle w:val="Compact"/>
       </w:pPr>
@@ -1010,7 +1022,7 @@
       <w:pPr>
         <w:numPr>
           <w:ilvl w:val="0"/>
-          <w:numId w:val="1006"/>
+          <w:numId w:val="1008"/>
         </w:numPr>
         <w:pStyle w:val="Compact"/>
       </w:pPr>
@@ -1594,7 +1606,7 @@
       <w:pPr>
         <w:numPr>
           <w:ilvl w:val="0"/>
-          <w:numId w:val="1007"/>
+          <w:numId w:val="1009"/>
         </w:numPr>
         <w:pStyle w:val="Compact"/>
       </w:pPr>
@@ -1606,7 +1618,7 @@
       <w:pPr>
         <w:numPr>
           <w:ilvl w:val="0"/>
-          <w:numId w:val="1007"/>
+          <w:numId w:val="1009"/>
         </w:numPr>
         <w:pStyle w:val="Compact"/>
       </w:pPr>
@@ -1618,7 +1630,7 @@
       <w:pPr>
         <w:numPr>
           <w:ilvl w:val="0"/>
-          <w:numId w:val="1007"/>
+          <w:numId w:val="1009"/>
         </w:numPr>
         <w:pStyle w:val="Compact"/>
       </w:pPr>
@@ -1630,7 +1642,7 @@
       <w:pPr>
         <w:numPr>
           <w:ilvl w:val="0"/>
-          <w:numId w:val="1007"/>
+          <w:numId w:val="1009"/>
         </w:numPr>
         <w:pStyle w:val="Compact"/>
       </w:pPr>
@@ -1678,7 +1690,7 @@
       <w:pPr>
         <w:numPr>
           <w:ilvl w:val="0"/>
-          <w:numId w:val="1008"/>
+          <w:numId w:val="1010"/>
         </w:numPr>
         <w:pStyle w:val="Compact"/>
       </w:pPr>
@@ -1700,7 +1712,7 @@
       <w:pPr>
         <w:numPr>
           <w:ilvl w:val="0"/>
-          <w:numId w:val="1008"/>
+          <w:numId w:val="1010"/>
         </w:numPr>
         <w:pStyle w:val="Compact"/>
       </w:pPr>
@@ -1722,7 +1734,7 @@
       <w:pPr>
         <w:numPr>
           <w:ilvl w:val="0"/>
-          <w:numId w:val="1008"/>
+          <w:numId w:val="1010"/>
         </w:numPr>
         <w:pStyle w:val="Compact"/>
       </w:pPr>
@@ -1734,7 +1746,7 @@
       <w:pPr>
         <w:numPr>
           <w:ilvl w:val="0"/>
-          <w:numId w:val="1008"/>
+          <w:numId w:val="1010"/>
         </w:numPr>
         <w:pStyle w:val="Compact"/>
       </w:pPr>
@@ -1830,7 +1842,7 @@
       <w:pPr>
         <w:numPr>
           <w:ilvl w:val="0"/>
-          <w:numId w:val="1009"/>
+          <w:numId w:val="1011"/>
         </w:numPr>
         <w:pStyle w:val="Compact"/>
       </w:pPr>
@@ -1852,7 +1864,7 @@
       <w:pPr>
         <w:numPr>
           <w:ilvl w:val="0"/>
-          <w:numId w:val="1009"/>
+          <w:numId w:val="1011"/>
         </w:numPr>
         <w:pStyle w:val="Compact"/>
       </w:pPr>
@@ -1874,7 +1886,7 @@
       <w:pPr>
         <w:numPr>
           <w:ilvl w:val="0"/>
-          <w:numId w:val="1009"/>
+          <w:numId w:val="1011"/>
         </w:numPr>
         <w:pStyle w:val="Compact"/>
       </w:pPr>
@@ -2006,7 +2018,7 @@
       <w:pPr>
         <w:numPr>
           <w:ilvl w:val="0"/>
-          <w:numId w:val="1010"/>
+          <w:numId w:val="1012"/>
         </w:numPr>
         <w:pStyle w:val="Compact"/>
       </w:pPr>
@@ -2028,7 +2040,7 @@
       <w:pPr>
         <w:numPr>
           <w:ilvl w:val="0"/>
-          <w:numId w:val="1010"/>
+          <w:numId w:val="1012"/>
         </w:numPr>
         <w:pStyle w:val="Compact"/>
       </w:pPr>
@@ -2097,7 +2109,7 @@
       <w:pPr>
         <w:numPr>
           <w:ilvl w:val="0"/>
-          <w:numId w:val="1011"/>
+          <w:numId w:val="1013"/>
         </w:numPr>
         <w:pStyle w:val="Compact"/>
       </w:pPr>
@@ -2119,7 +2131,7 @@
       <w:pPr>
         <w:numPr>
           <w:ilvl w:val="0"/>
-          <w:numId w:val="1011"/>
+          <w:numId w:val="1013"/>
         </w:numPr>
         <w:pStyle w:val="Compact"/>
       </w:pPr>
@@ -2170,7 +2182,7 @@
       <w:pPr>
         <w:numPr>
           <w:ilvl w:val="0"/>
-          <w:numId w:val="1012"/>
+          <w:numId w:val="1014"/>
         </w:numPr>
         <w:pStyle w:val="Compact"/>
       </w:pPr>
@@ -2211,7 +2223,7 @@
       <w:pPr>
         <w:numPr>
           <w:ilvl w:val="0"/>
-          <w:numId w:val="1012"/>
+          <w:numId w:val="1014"/>
         </w:numPr>
         <w:pStyle w:val="Compact"/>
       </w:pPr>
@@ -2236,7 +2248,7 @@
       <w:pPr>
         <w:numPr>
           <w:ilvl w:val="0"/>
-          <w:numId w:val="1012"/>
+          <w:numId w:val="1014"/>
         </w:numPr>
         <w:pStyle w:val="Compact"/>
       </w:pPr>
@@ -2248,7 +2260,7 @@
       <w:pPr>
         <w:numPr>
           <w:ilvl w:val="0"/>
-          <w:numId w:val="1012"/>
+          <w:numId w:val="1014"/>
         </w:numPr>
         <w:pStyle w:val="Compact"/>
       </w:pPr>
@@ -2382,7 +2394,7 @@
       <w:pPr>
         <w:numPr>
           <w:ilvl w:val="0"/>
-          <w:numId w:val="1013"/>
+          <w:numId w:val="1015"/>
         </w:numPr>
         <w:pStyle w:val="Compact"/>
       </w:pPr>
@@ -2404,7 +2416,7 @@
       <w:pPr>
         <w:numPr>
           <w:ilvl w:val="0"/>
-          <w:numId w:val="1013"/>
+          <w:numId w:val="1015"/>
         </w:numPr>
         <w:pStyle w:val="Compact"/>
       </w:pPr>
@@ -2426,7 +2438,7 @@
       <w:pPr>
         <w:numPr>
           <w:ilvl w:val="0"/>
-          <w:numId w:val="1013"/>
+          <w:numId w:val="1015"/>
         </w:numPr>
         <w:pStyle w:val="Compact"/>
       </w:pPr>
@@ -2456,7 +2468,7 @@
       <w:pPr>
         <w:numPr>
           <w:ilvl w:val="0"/>
-          <w:numId w:val="1014"/>
+          <w:numId w:val="1016"/>
         </w:numPr>
         <w:pStyle w:val="Compact"/>
       </w:pPr>
@@ -2468,7 +2480,7 @@
       <w:pPr>
         <w:numPr>
           <w:ilvl w:val="0"/>
-          <w:numId w:val="1014"/>
+          <w:numId w:val="1016"/>
         </w:numPr>
         <w:pStyle w:val="Compact"/>
       </w:pPr>
@@ -6410,7 +6422,7 @@
       <w:pPr>
         <w:numPr>
           <w:ilvl w:val="0"/>
-          <w:numId w:val="1015"/>
+          <w:numId w:val="1017"/>
         </w:numPr>
         <w:pStyle w:val="Compact"/>
       </w:pPr>
@@ -6432,7 +6444,7 @@
       <w:pPr>
         <w:numPr>
           <w:ilvl w:val="0"/>
-          <w:numId w:val="1015"/>
+          <w:numId w:val="1017"/>
         </w:numPr>
         <w:pStyle w:val="Compact"/>
       </w:pPr>
@@ -6951,7 +6963,7 @@
       <w:pPr>
         <w:numPr>
           <w:ilvl w:val="0"/>
-          <w:numId w:val="1016"/>
+          <w:numId w:val="1018"/>
         </w:numPr>
         <w:pStyle w:val="Compact"/>
       </w:pPr>
@@ -6973,7 +6985,7 @@
       <w:pPr>
         <w:numPr>
           <w:ilvl w:val="0"/>
-          <w:numId w:val="1016"/>
+          <w:numId w:val="1018"/>
         </w:numPr>
         <w:pStyle w:val="Compact"/>
       </w:pPr>
@@ -6995,7 +7007,7 @@
       <w:pPr>
         <w:numPr>
           <w:ilvl w:val="0"/>
-          <w:numId w:val="1016"/>
+          <w:numId w:val="1018"/>
         </w:numPr>
         <w:pStyle w:val="Compact"/>
       </w:pPr>
@@ -7025,7 +7037,7 @@
       <w:pPr>
         <w:numPr>
           <w:ilvl w:val="0"/>
-          <w:numId w:val="1017"/>
+          <w:numId w:val="1019"/>
         </w:numPr>
         <w:pStyle w:val="Compact"/>
       </w:pPr>
@@ -7047,7 +7059,7 @@
       <w:pPr>
         <w:numPr>
           <w:ilvl w:val="0"/>
-          <w:numId w:val="1017"/>
+          <w:numId w:val="1019"/>
         </w:numPr>
         <w:pStyle w:val="Compact"/>
       </w:pPr>
@@ -9382,7 +9394,7 @@
       <w:pPr>
         <w:numPr>
           <w:ilvl w:val="0"/>
-          <w:numId w:val="1018"/>
+          <w:numId w:val="1020"/>
         </w:numPr>
         <w:pStyle w:val="Compact"/>
       </w:pPr>
@@ -9404,7 +9416,7 @@
       <w:pPr>
         <w:numPr>
           <w:ilvl w:val="0"/>
-          <w:numId w:val="1018"/>
+          <w:numId w:val="1020"/>
         </w:numPr>
         <w:pStyle w:val="Compact"/>
       </w:pPr>
@@ -9426,7 +9438,7 @@
       <w:pPr>
         <w:numPr>
           <w:ilvl w:val="0"/>
-          <w:numId w:val="1018"/>
+          <w:numId w:val="1020"/>
         </w:numPr>
         <w:pStyle w:val="Compact"/>
       </w:pPr>
@@ -9448,7 +9460,7 @@
       <w:pPr>
         <w:numPr>
           <w:ilvl w:val="0"/>
-          <w:numId w:val="1018"/>
+          <w:numId w:val="1020"/>
         </w:numPr>
         <w:pStyle w:val="Compact"/>
       </w:pPr>
@@ -9470,7 +9482,7 @@
       <w:pPr>
         <w:numPr>
           <w:ilvl w:val="0"/>
-          <w:numId w:val="1018"/>
+          <w:numId w:val="1020"/>
         </w:numPr>
         <w:pStyle w:val="Compact"/>
       </w:pPr>
@@ -9894,7 +9906,7 @@
       <w:pPr>
         <w:numPr>
           <w:ilvl w:val="0"/>
-          <w:numId w:val="1019"/>
+          <w:numId w:val="1021"/>
         </w:numPr>
         <w:pStyle w:val="Compact"/>
       </w:pPr>
@@ -9916,7 +9928,7 @@
       <w:pPr>
         <w:numPr>
           <w:ilvl w:val="0"/>
-          <w:numId w:val="1019"/>
+          <w:numId w:val="1021"/>
         </w:numPr>
         <w:pStyle w:val="Compact"/>
       </w:pPr>
@@ -9938,7 +9950,7 @@
       <w:pPr>
         <w:numPr>
           <w:ilvl w:val="0"/>
-          <w:numId w:val="1019"/>
+          <w:numId w:val="1021"/>
         </w:numPr>
         <w:pStyle w:val="Compact"/>
       </w:pPr>
@@ -10200,7 +10212,7 @@
       <w:pPr>
         <w:numPr>
           <w:ilvl w:val="0"/>
-          <w:numId w:val="1020"/>
+          <w:numId w:val="1022"/>
         </w:numPr>
         <w:pStyle w:val="Compact"/>
       </w:pPr>
@@ -10222,7 +10234,7 @@
       <w:pPr>
         <w:numPr>
           <w:ilvl w:val="0"/>
-          <w:numId w:val="1020"/>
+          <w:numId w:val="1022"/>
         </w:numPr>
         <w:pStyle w:val="Compact"/>
       </w:pPr>
@@ -10280,7 +10292,7 @@
       <w:pPr>
         <w:numPr>
           <w:ilvl w:val="0"/>
-          <w:numId w:val="1021"/>
+          <w:numId w:val="1023"/>
         </w:numPr>
         <w:pStyle w:val="Compact"/>
       </w:pPr>
@@ -10302,7 +10314,7 @@
       <w:pPr>
         <w:numPr>
           <w:ilvl w:val="0"/>
-          <w:numId w:val="1021"/>
+          <w:numId w:val="1023"/>
         </w:numPr>
         <w:pStyle w:val="Compact"/>
       </w:pPr>
@@ -10324,7 +10336,7 @@
       <w:pPr>
         <w:numPr>
           <w:ilvl w:val="1"/>
-          <w:numId w:val="1022"/>
+          <w:numId w:val="1024"/>
         </w:numPr>
         <w:pStyle w:val="Compact"/>
       </w:pPr>
@@ -10336,7 +10348,7 @@
       <w:pPr>
         <w:numPr>
           <w:ilvl w:val="1"/>
-          <w:numId w:val="1022"/>
+          <w:numId w:val="1024"/>
         </w:numPr>
         <w:pStyle w:val="Compact"/>
       </w:pPr>
@@ -10348,7 +10360,7 @@
       <w:pPr>
         <w:numPr>
           <w:ilvl w:val="1"/>
-          <w:numId w:val="1022"/>
+          <w:numId w:val="1024"/>
         </w:numPr>
         <w:pStyle w:val="Compact"/>
       </w:pPr>
@@ -10360,7 +10372,7 @@
       <w:pPr>
         <w:numPr>
           <w:ilvl w:val="0"/>
-          <w:numId w:val="1021"/>
+          <w:numId w:val="1023"/>
         </w:numPr>
         <w:pStyle w:val="Compact"/>
       </w:pPr>
@@ -10382,7 +10394,7 @@
       <w:pPr>
         <w:numPr>
           <w:ilvl w:val="0"/>
-          <w:numId w:val="1021"/>
+          <w:numId w:val="1023"/>
         </w:numPr>
         <w:pStyle w:val="Compact"/>
       </w:pPr>
@@ -10404,7 +10416,7 @@
       <w:pPr>
         <w:numPr>
           <w:ilvl w:val="0"/>
-          <w:numId w:val="1021"/>
+          <w:numId w:val="1023"/>
         </w:numPr>
         <w:pStyle w:val="Compact"/>
       </w:pPr>
@@ -10426,7 +10438,7 @@
       <w:pPr>
         <w:numPr>
           <w:ilvl w:val="0"/>
-          <w:numId w:val="1021"/>
+          <w:numId w:val="1023"/>
         </w:numPr>
         <w:pStyle w:val="Compact"/>
       </w:pPr>
@@ -10459,7 +10471,7 @@
       <w:pPr>
         <w:numPr>
           <w:ilvl w:val="0"/>
-          <w:numId w:val="1023"/>
+          <w:numId w:val="1025"/>
         </w:numPr>
         <w:pStyle w:val="Compact"/>
       </w:pPr>
@@ -10520,7 +10532,7 @@
       <w:pPr>
         <w:numPr>
           <w:ilvl w:val="0"/>
-          <w:numId w:val="1023"/>
+          <w:numId w:val="1025"/>
         </w:numPr>
         <w:pStyle w:val="Compact"/>
       </w:pPr>
@@ -10542,7 +10554,7 @@
       <w:pPr>
         <w:numPr>
           <w:ilvl w:val="1"/>
-          <w:numId w:val="1024"/>
+          <w:numId w:val="1026"/>
         </w:numPr>
         <w:pStyle w:val="Compact"/>
       </w:pPr>
@@ -10564,7 +10576,7 @@
       <w:pPr>
         <w:numPr>
           <w:ilvl w:val="1"/>
-          <w:numId w:val="1024"/>
+          <w:numId w:val="1026"/>
         </w:numPr>
         <w:pStyle w:val="Compact"/>
       </w:pPr>
@@ -10586,7 +10598,7 @@
       <w:pPr>
         <w:numPr>
           <w:ilvl w:val="1"/>
-          <w:numId w:val="1024"/>
+          <w:numId w:val="1026"/>
         </w:numPr>
         <w:pStyle w:val="Compact"/>
       </w:pPr>
@@ -10608,7 +10620,7 @@
       <w:pPr>
         <w:numPr>
           <w:ilvl w:val="1"/>
-          <w:numId w:val="1024"/>
+          <w:numId w:val="1026"/>
         </w:numPr>
         <w:pStyle w:val="Compact"/>
       </w:pPr>
@@ -10630,7 +10642,7 @@
       <w:pPr>
         <w:numPr>
           <w:ilvl w:val="0"/>
-          <w:numId w:val="1023"/>
+          <w:numId w:val="1025"/>
         </w:numPr>
         <w:pStyle w:val="Compact"/>
       </w:pPr>
@@ -10652,43 +10664,43 @@
       <w:pPr>
         <w:numPr>
           <w:ilvl w:val="1"/>
+          <w:numId w:val="1027"/>
+        </w:numPr>
+        <w:pStyle w:val="Compact"/>
+      </w:pPr>
+      <w:r>
+        <w:t xml:space="preserve">state-level PERM eligibility rates, which carry federal match consequences from FY 2030 (P.L. 119-21);</w:t>
+      </w:r>
+    </w:p>
+    <w:p>
+      <w:pPr>
+        <w:numPr>
+          <w:ilvl w:val="1"/>
+          <w:numId w:val="1027"/>
+        </w:numPr>
+        <w:pStyle w:val="Compact"/>
+      </w:pPr>
+      <w:r>
+        <w:t xml:space="preserve">State-based Exchange measurement from 2027;</w:t>
+      </w:r>
+    </w:p>
+    <w:p>
+      <w:pPr>
+        <w:numPr>
+          <w:ilvl w:val="1"/>
+          <w:numId w:val="1027"/>
+        </w:numPr>
+        <w:pStyle w:val="Compact"/>
+      </w:pPr>
+      <w:r>
+        <w:t xml:space="preserve">contract-level RADV, where the interval becomes a lower bound for recovery and one-sided coverage matters.</w:t>
+      </w:r>
+    </w:p>
+    <w:p>
+      <w:pPr>
+        <w:numPr>
+          <w:ilvl w:val="0"/>
           <w:numId w:val="1025"/>
-        </w:numPr>
-        <w:pStyle w:val="Compact"/>
-      </w:pPr>
-      <w:r>
-        <w:t xml:space="preserve">state-level PERM eligibility rates, which carry federal match consequences from FY 2030 (P.L. 119-21);</w:t>
-      </w:r>
-    </w:p>
-    <w:p>
-      <w:pPr>
-        <w:numPr>
-          <w:ilvl w:val="1"/>
-          <w:numId w:val="1025"/>
-        </w:numPr>
-        <w:pStyle w:val="Compact"/>
-      </w:pPr>
-      <w:r>
-        <w:t xml:space="preserve">State-based Exchange measurement from 2027;</w:t>
-      </w:r>
-    </w:p>
-    <w:p>
-      <w:pPr>
-        <w:numPr>
-          <w:ilvl w:val="1"/>
-          <w:numId w:val="1025"/>
-        </w:numPr>
-        <w:pStyle w:val="Compact"/>
-      </w:pPr>
-      <w:r>
-        <w:t xml:space="preserve">contract-level RADV, where the interval becomes a lower bound for recovery and one-sided coverage matters.</w:t>
-      </w:r>
-    </w:p>
-    <w:p>
-      <w:pPr>
-        <w:numPr>
-          <w:ilvl w:val="0"/>
-          <w:numId w:val="1023"/>
         </w:numPr>
         <w:pStyle w:val="Compact"/>
       </w:pPr>
@@ -10788,7 +10800,7 @@
       <w:pPr>
         <w:numPr>
           <w:ilvl w:val="0"/>
-          <w:numId w:val="1026"/>
+          <w:numId w:val="1028"/>
         </w:numPr>
         <w:pStyle w:val="Compact"/>
       </w:pPr>
@@ -10816,7 +10828,7 @@
       <w:pPr>
         <w:numPr>
           <w:ilvl w:val="0"/>
-          <w:numId w:val="1026"/>
+          <w:numId w:val="1028"/>
         </w:numPr>
         <w:pStyle w:val="Compact"/>
       </w:pPr>
@@ -10828,7 +10840,7 @@
       <w:pPr>
         <w:numPr>
           <w:ilvl w:val="0"/>
-          <w:numId w:val="1026"/>
+          <w:numId w:val="1028"/>
         </w:numPr>
         <w:pStyle w:val="Compact"/>
       </w:pPr>
@@ -10840,7 +10852,7 @@
       <w:pPr>
         <w:numPr>
           <w:ilvl w:val="0"/>
-          <w:numId w:val="1026"/>
+          <w:numId w:val="1028"/>
         </w:numPr>
         <w:pStyle w:val="Compact"/>
       </w:pPr>
@@ -10852,7 +10864,7 @@
       <w:pPr>
         <w:numPr>
           <w:ilvl w:val="0"/>
-          <w:numId w:val="1026"/>
+          <w:numId w:val="1028"/>
         </w:numPr>
         <w:pStyle w:val="Compact"/>
       </w:pPr>
@@ -10864,7 +10876,7 @@
       <w:pPr>
         <w:numPr>
           <w:ilvl w:val="0"/>
-          <w:numId w:val="1026"/>
+          <w:numId w:val="1028"/>
         </w:numPr>
         <w:pStyle w:val="Compact"/>
       </w:pPr>
@@ -10876,7 +10888,7 @@
       <w:pPr>
         <w:numPr>
           <w:ilvl w:val="0"/>
-          <w:numId w:val="1026"/>
+          <w:numId w:val="1028"/>
         </w:numPr>
         <w:pStyle w:val="Compact"/>
       </w:pPr>
@@ -10888,7 +10900,7 @@
       <w:pPr>
         <w:numPr>
           <w:ilvl w:val="0"/>
-          <w:numId w:val="1026"/>
+          <w:numId w:val="1028"/>
         </w:numPr>
         <w:pStyle w:val="Compact"/>
       </w:pPr>
@@ -10900,7 +10912,7 @@
       <w:pPr>
         <w:numPr>
           <w:ilvl w:val="0"/>
-          <w:numId w:val="1026"/>
+          <w:numId w:val="1028"/>
         </w:numPr>
         <w:pStyle w:val="Compact"/>
       </w:pPr>
@@ -10912,7 +10924,34 @@
       <w:pPr>
         <w:numPr>
           <w:ilvl w:val="0"/>
-          <w:numId w:val="1026"/>
+          <w:numId w:val="1028"/>
+        </w:numPr>
+        <w:pStyle w:val="Compact"/>
+      </w:pPr>
+      <w:r>
+        <w:t xml:space="preserve">Cistola A (2026). Methods for estimating improper payments in federal health programs: a narrative review of their comparative accuracy. Companion review,</w:t>
+      </w:r>
+      <w:r>
+        <w:t xml:space="preserve"> </w:t>
+      </w:r>
+      <w:r>
+        <w:rPr>
+          <w:rStyle w:val="VerbatimChar"/>
+        </w:rPr>
+        <w:t xml:space="preserve">literature-review/</w:t>
+      </w:r>
+      <w:r>
+        <w:t xml:space="preserve"> </w:t>
+      </w:r>
+      <w:r>
+        <w:t xml:space="preserve">in the study repository.</w:t>
+      </w:r>
+    </w:p>
+    <w:p>
+      <w:pPr>
+        <w:numPr>
+          <w:ilvl w:val="0"/>
+          <w:numId w:val="1028"/>
         </w:numPr>
         <w:pStyle w:val="Compact"/>
       </w:pPr>
@@ -10937,7 +10976,7 @@
       <w:pPr>
         <w:numPr>
           <w:ilvl w:val="0"/>
-          <w:numId w:val="1026"/>
+          <w:numId w:val="1028"/>
         </w:numPr>
         <w:pStyle w:val="Compact"/>
       </w:pPr>
@@ -10962,7 +11001,7 @@
       <w:pPr>
         <w:numPr>
           <w:ilvl w:val="0"/>
-          <w:numId w:val="1026"/>
+          <w:numId w:val="1028"/>
         </w:numPr>
         <w:pStyle w:val="Compact"/>
       </w:pPr>
@@ -10974,7 +11013,7 @@
       <w:pPr>
         <w:numPr>
           <w:ilvl w:val="0"/>
-          <w:numId w:val="1026"/>
+          <w:numId w:val="1028"/>
         </w:numPr>
         <w:pStyle w:val="Compact"/>
       </w:pPr>
@@ -11002,7 +11041,7 @@
       <w:pPr>
         <w:numPr>
           <w:ilvl w:val="0"/>
-          <w:numId w:val="1026"/>
+          <w:numId w:val="1028"/>
         </w:numPr>
         <w:pStyle w:val="Compact"/>
       </w:pPr>
@@ -11030,7 +11069,7 @@
       <w:pPr>
         <w:numPr>
           <w:ilvl w:val="0"/>
-          <w:numId w:val="1026"/>
+          <w:numId w:val="1028"/>
         </w:numPr>
         <w:pStyle w:val="Compact"/>
       </w:pPr>
@@ -11055,7 +11094,7 @@
       <w:pPr>
         <w:numPr>
           <w:ilvl w:val="0"/>
-          <w:numId w:val="1026"/>
+          <w:numId w:val="1028"/>
         </w:numPr>
         <w:pStyle w:val="Compact"/>
       </w:pPr>
@@ -11083,7 +11122,7 @@
       <w:pPr>
         <w:numPr>
           <w:ilvl w:val="0"/>
-          <w:numId w:val="1026"/>
+          <w:numId w:val="1028"/>
         </w:numPr>
         <w:pStyle w:val="Compact"/>
       </w:pPr>
@@ -11111,7 +11150,7 @@
       <w:pPr>
         <w:numPr>
           <w:ilvl w:val="0"/>
-          <w:numId w:val="1026"/>
+          <w:numId w:val="1028"/>
         </w:numPr>
         <w:pStyle w:val="Compact"/>
       </w:pPr>
@@ -11139,7 +11178,7 @@
       <w:pPr>
         <w:numPr>
           <w:ilvl w:val="0"/>
-          <w:numId w:val="1026"/>
+          <w:numId w:val="1028"/>
         </w:numPr>
         <w:pStyle w:val="Compact"/>
       </w:pPr>
@@ -11167,7 +11206,7 @@
       <w:pPr>
         <w:numPr>
           <w:ilvl w:val="0"/>
-          <w:numId w:val="1026"/>
+          <w:numId w:val="1028"/>
         </w:numPr>
         <w:pStyle w:val="Compact"/>
       </w:pPr>
@@ -11195,7 +11234,7 @@
       <w:pPr>
         <w:numPr>
           <w:ilvl w:val="0"/>
-          <w:numId w:val="1026"/>
+          <w:numId w:val="1028"/>
         </w:numPr>
         <w:pStyle w:val="Compact"/>
       </w:pPr>
@@ -11220,7 +11259,7 @@
       <w:pPr>
         <w:numPr>
           <w:ilvl w:val="0"/>
-          <w:numId w:val="1026"/>
+          <w:numId w:val="1028"/>
         </w:numPr>
         <w:pStyle w:val="Compact"/>
       </w:pPr>
@@ -11232,7 +11271,7 @@
       <w:pPr>
         <w:numPr>
           <w:ilvl w:val="0"/>
-          <w:numId w:val="1026"/>
+          <w:numId w:val="1028"/>
         </w:numPr>
         <w:pStyle w:val="Compact"/>
       </w:pPr>
@@ -11244,7 +11283,7 @@
       <w:pPr>
         <w:numPr>
           <w:ilvl w:val="0"/>
-          <w:numId w:val="1026"/>
+          <w:numId w:val="1028"/>
         </w:numPr>
         <w:pStyle w:val="Compact"/>
       </w:pPr>
@@ -11272,7 +11311,7 @@
       <w:pPr>
         <w:numPr>
           <w:ilvl w:val="0"/>
-          <w:numId w:val="1026"/>
+          <w:numId w:val="1028"/>
         </w:numPr>
         <w:pStyle w:val="Compact"/>
       </w:pPr>
@@ -11341,7 +11380,7 @@
       <w:pPr>
         <w:numPr>
           <w:ilvl w:val="0"/>
-          <w:numId w:val="1027"/>
+          <w:numId w:val="1029"/>
         </w:numPr>
         <w:pStyle w:val="Compact"/>
       </w:pPr>
@@ -11364,7 +11403,7 @@
       <w:pPr>
         <w:numPr>
           <w:ilvl w:val="1"/>
-          <w:numId w:val="1028"/>
+          <w:numId w:val="1030"/>
         </w:numPr>
         <w:pStyle w:val="Compact"/>
       </w:pPr>
@@ -11376,7 +11415,7 @@
       <w:pPr>
         <w:numPr>
           <w:ilvl w:val="1"/>
-          <w:numId w:val="1028"/>
+          <w:numId w:val="1030"/>
         </w:numPr>
         <w:pStyle w:val="Compact"/>
       </w:pPr>
@@ -11388,7 +11427,7 @@
       <w:pPr>
         <w:numPr>
           <w:ilvl w:val="1"/>
-          <w:numId w:val="1028"/>
+          <w:numId w:val="1030"/>
         </w:numPr>
         <w:pStyle w:val="Compact"/>
       </w:pPr>
@@ -11432,7 +11471,7 @@
       <w:pPr>
         <w:numPr>
           <w:ilvl w:val="1"/>
-          <w:numId w:val="1028"/>
+          <w:numId w:val="1030"/>
         </w:numPr>
         <w:pStyle w:val="Compact"/>
       </w:pPr>
@@ -11456,7 +11495,7 @@
       <w:pPr>
         <w:numPr>
           <w:ilvl w:val="0"/>
-          <w:numId w:val="1027"/>
+          <w:numId w:val="1029"/>
         </w:numPr>
         <w:pStyle w:val="Compact"/>
       </w:pPr>
@@ -11479,7 +11518,7 @@
       <w:pPr>
         <w:numPr>
           <w:ilvl w:val="1"/>
-          <w:numId w:val="1029"/>
+          <w:numId w:val="1031"/>
         </w:numPr>
         <w:pStyle w:val="Compact"/>
       </w:pPr>
@@ -11491,7 +11530,7 @@
       <w:pPr>
         <w:numPr>
           <w:ilvl w:val="1"/>
-          <w:numId w:val="1029"/>
+          <w:numId w:val="1031"/>
         </w:numPr>
         <w:pStyle w:val="Compact"/>
       </w:pPr>
@@ -11515,7 +11554,7 @@
       <w:pPr>
         <w:numPr>
           <w:ilvl w:val="1"/>
-          <w:numId w:val="1029"/>
+          <w:numId w:val="1031"/>
         </w:numPr>
         <w:pStyle w:val="Compact"/>
       </w:pPr>
@@ -11542,7 +11581,7 @@
       <w:pPr>
         <w:numPr>
           <w:ilvl w:val="1"/>
-          <w:numId w:val="1029"/>
+          <w:numId w:val="1031"/>
         </w:numPr>
         <w:pStyle w:val="Compact"/>
       </w:pPr>
@@ -11569,7 +11608,7 @@
       <w:pPr>
         <w:numPr>
           <w:ilvl w:val="1"/>
-          <w:numId w:val="1029"/>
+          <w:numId w:val="1031"/>
         </w:numPr>
         <w:pStyle w:val="Compact"/>
       </w:pPr>
@@ -11662,7 +11701,7 @@
       <w:pPr>
         <w:numPr>
           <w:ilvl w:val="0"/>
-          <w:numId w:val="1030"/>
+          <w:numId w:val="1032"/>
         </w:numPr>
         <w:pStyle w:val="Compact"/>
       </w:pPr>
@@ -11708,7 +11747,7 @@
       <w:pPr>
         <w:numPr>
           <w:ilvl w:val="0"/>
-          <w:numId w:val="1030"/>
+          <w:numId w:val="1032"/>
         </w:numPr>
         <w:pStyle w:val="Compact"/>
       </w:pPr>
@@ -11742,7 +11781,7 @@
       <w:pPr>
         <w:numPr>
           <w:ilvl w:val="0"/>
-          <w:numId w:val="1030"/>
+          <w:numId w:val="1032"/>
         </w:numPr>
         <w:pStyle w:val="Compact"/>
       </w:pPr>
@@ -11791,7 +11830,7 @@
       <w:pPr>
         <w:numPr>
           <w:ilvl w:val="0"/>
-          <w:numId w:val="1030"/>
+          <w:numId w:val="1032"/>
         </w:numPr>
         <w:pStyle w:val="Compact"/>
       </w:pPr>
@@ -12062,7 +12101,7 @@
       <w:pPr>
         <w:numPr>
           <w:ilvl w:val="0"/>
-          <w:numId w:val="1031"/>
+          <w:numId w:val="1033"/>
         </w:numPr>
         <w:pStyle w:val="Compact"/>
       </w:pPr>
@@ -12084,7 +12123,7 @@
       <w:pPr>
         <w:numPr>
           <w:ilvl w:val="0"/>
-          <w:numId w:val="1031"/>
+          <w:numId w:val="1033"/>
         </w:numPr>
         <w:pStyle w:val="Compact"/>
       </w:pPr>
@@ -12100,7 +12139,7 @@
       <w:pPr>
         <w:numPr>
           <w:ilvl w:val="1"/>
-          <w:numId w:val="1032"/>
+          <w:numId w:val="1034"/>
         </w:numPr>
         <w:pStyle w:val="Compact"/>
       </w:pPr>
@@ -12122,7 +12161,7 @@
       <w:pPr>
         <w:numPr>
           <w:ilvl w:val="1"/>
-          <w:numId w:val="1032"/>
+          <w:numId w:val="1034"/>
         </w:numPr>
         <w:pStyle w:val="Compact"/>
       </w:pPr>
@@ -12144,7 +12183,7 @@
       <w:pPr>
         <w:numPr>
           <w:ilvl w:val="1"/>
-          <w:numId w:val="1032"/>
+          <w:numId w:val="1034"/>
         </w:numPr>
         <w:pStyle w:val="Compact"/>
       </w:pPr>
@@ -12156,7 +12195,7 @@
       <w:pPr>
         <w:numPr>
           <w:ilvl w:val="1"/>
-          <w:numId w:val="1032"/>
+          <w:numId w:val="1034"/>
         </w:numPr>
         <w:pStyle w:val="Compact"/>
       </w:pPr>
@@ -12168,7 +12207,7 @@
       <w:pPr>
         <w:numPr>
           <w:ilvl w:val="0"/>
-          <w:numId w:val="1031"/>
+          <w:numId w:val="1033"/>
         </w:numPr>
         <w:pStyle w:val="Compact"/>
       </w:pPr>
@@ -12203,7 +12242,7 @@
       <w:pPr>
         <w:numPr>
           <w:ilvl w:val="0"/>
-          <w:numId w:val="1031"/>
+          <w:numId w:val="1033"/>
         </w:numPr>
         <w:pStyle w:val="Compact"/>
       </w:pPr>
@@ -12225,7 +12264,7 @@
       <w:pPr>
         <w:numPr>
           <w:ilvl w:val="0"/>
-          <w:numId w:val="1031"/>
+          <w:numId w:val="1033"/>
         </w:numPr>
         <w:pStyle w:val="Compact"/>
       </w:pPr>
@@ -12281,7 +12320,7 @@
       <w:pPr>
         <w:numPr>
           <w:ilvl w:val="0"/>
-          <w:numId w:val="1033"/>
+          <w:numId w:val="1035"/>
         </w:numPr>
         <w:pStyle w:val="Compact"/>
       </w:pPr>
@@ -12319,7 +12358,7 @@
       <w:pPr>
         <w:numPr>
           <w:ilvl w:val="1"/>
-          <w:numId w:val="1034"/>
+          <w:numId w:val="1036"/>
         </w:numPr>
         <w:pStyle w:val="Compact"/>
       </w:pPr>
@@ -12341,7 +12380,7 @@
       <w:pPr>
         <w:numPr>
           <w:ilvl w:val="1"/>
-          <w:numId w:val="1034"/>
+          <w:numId w:val="1036"/>
         </w:numPr>
         <w:pStyle w:val="Compact"/>
       </w:pPr>
@@ -12363,7 +12402,7 @@
       <w:pPr>
         <w:numPr>
           <w:ilvl w:val="1"/>
-          <w:numId w:val="1034"/>
+          <w:numId w:val="1036"/>
         </w:numPr>
         <w:pStyle w:val="Compact"/>
       </w:pPr>
@@ -12375,7 +12414,7 @@
       <w:pPr>
         <w:numPr>
           <w:ilvl w:val="0"/>
-          <w:numId w:val="1033"/>
+          <w:numId w:val="1035"/>
         </w:numPr>
         <w:pStyle w:val="Compact"/>
       </w:pPr>
@@ -12498,7 +12537,7 @@
       <w:pPr>
         <w:numPr>
           <w:ilvl w:val="0"/>
-          <w:numId w:val="1033"/>
+          <w:numId w:val="1035"/>
         </w:numPr>
         <w:pStyle w:val="Compact"/>
       </w:pPr>
@@ -12533,7 +12572,7 @@
       <w:pPr>
         <w:numPr>
           <w:ilvl w:val="0"/>
-          <w:numId w:val="1033"/>
+          <w:numId w:val="1035"/>
         </w:numPr>
         <w:pStyle w:val="Compact"/>
       </w:pPr>
@@ -12568,7 +12607,7 @@
       <w:pPr>
         <w:numPr>
           <w:ilvl w:val="0"/>
-          <w:numId w:val="1033"/>
+          <w:numId w:val="1035"/>
         </w:numPr>
         <w:pStyle w:val="Compact"/>
       </w:pPr>
@@ -12590,7 +12629,7 @@
       <w:pPr>
         <w:numPr>
           <w:ilvl w:val="0"/>
-          <w:numId w:val="1033"/>
+          <w:numId w:val="1035"/>
         </w:numPr>
         <w:pStyle w:val="Compact"/>
       </w:pPr>
@@ -12690,28 +12729,46 @@
       <w:r>
         <w:t xml:space="preserve">(330,253 enrollees × 100):</w:t>
       </w:r>
-      <w:r>
-        <w:t xml:space="preserve"> </w:t>
-      </w:r>
-      <w:r>
-        <w:t xml:space="preserve">- 550 contracts with lognormal enrollment and a coding-intensity factor.</w:t>
-      </w:r>
-      <w:r>
-        <w:t xml:space="preserve"> </w:t>
-      </w:r>
-      <w:r>
-        <w:t xml:space="preserve">- HCCs from 10 illustrative families, each with a mild and a severe level.</w:t>
-      </w:r>
-      <w:r>
-        <w:t xml:space="preserve"> </w:t>
-      </w:r>
-      <w:r>
-        <w:t xml:space="preserve">- Payment = risk score × county rate × months, scaled to $388.72B of payments subject to risk adjustment.</w:t>
-      </w:r>
-    </w:p>
-    <w:p>
-      <w:pPr>
-        <w:pStyle w:val="BodyText"/>
+    </w:p>
+    <w:p>
+      <w:pPr>
+        <w:numPr>
+          <w:ilvl w:val="0"/>
+          <w:numId w:val="1037"/>
+        </w:numPr>
+        <w:pStyle w:val="Compact"/>
+      </w:pPr>
+      <w:r>
+        <w:t xml:space="preserve">550 contracts with lognormal enrollment and a coding-intensity factor.</w:t>
+      </w:r>
+    </w:p>
+    <w:p>
+      <w:pPr>
+        <w:numPr>
+          <w:ilvl w:val="0"/>
+          <w:numId w:val="1037"/>
+        </w:numPr>
+        <w:pStyle w:val="Compact"/>
+      </w:pPr>
+      <w:r>
+        <w:t xml:space="preserve">HCCs from 10 illustrative families, each with a mild and a severe level.</w:t>
+      </w:r>
+    </w:p>
+    <w:p>
+      <w:pPr>
+        <w:numPr>
+          <w:ilvl w:val="0"/>
+          <w:numId w:val="1037"/>
+        </w:numPr>
+        <w:pStyle w:val="Compact"/>
+      </w:pPr>
+      <w:r>
+        <w:t xml:space="preserve">Payment = risk score × county rate × months, scaled to $388.72B of payments subject to risk adjustment.</w:t>
+      </w:r>
+    </w:p>
+    <w:p>
+      <w:pPr>
+        <w:pStyle w:val="FirstParagraph"/>
       </w:pPr>
       <w:r>
         <w:rPr>
@@ -12720,40 +12777,70 @@
         </w:rPr>
         <w:t xml:space="preserve">Errors:</w:t>
       </w:r>
-      <w:r>
-        <w:t xml:space="preserve"> </w:t>
-      </w:r>
-      <w:r>
-        <w:t xml:space="preserve">- HCCs not supported by the record: deleted, or moved down the hierarchy (severe to mild).</w:t>
-      </w:r>
-      <w:r>
-        <w:t xml:space="preserve"> </w:t>
-      </w:r>
-      <w:r>
-        <w:t xml:space="preserve">- Missing documentation: every coded HCC is lost.</w:t>
-      </w:r>
-      <w:r>
-        <w:t xml:space="preserve"> </w:t>
-      </w:r>
-      <w:r>
-        <w:t xml:space="preserve">- HCCs supported by the record but not coded: underpayments.</w:t>
-      </w:r>
-      <w:r>
-        <w:t xml:space="preserve"> </w:t>
-      </w:r>
-      <w:r>
-        <w:t xml:space="preserve">- Calibrated to the FY 2025 Part C results: gross 6.09%, overpayments $21.43B, underpayments $2.23B, missing documentation 0.22%.</w:t>
-      </w:r>
-      <w:r>
-        <w:t xml:space="preserve"> </w:t>
-      </w:r>
-      <w:r>
-        <w:t xml:space="preserve">- The simulated truth is gross 6.06% ($23.57B).</w:t>
-      </w:r>
-    </w:p>
-    <w:p>
-      <w:pPr>
-        <w:pStyle w:val="BodyText"/>
+    </w:p>
+    <w:p>
+      <w:pPr>
+        <w:numPr>
+          <w:ilvl w:val="0"/>
+          <w:numId w:val="1038"/>
+        </w:numPr>
+        <w:pStyle w:val="Compact"/>
+      </w:pPr>
+      <w:r>
+        <w:t xml:space="preserve">HCCs not supported by the record: deleted, or moved down the hierarchy (severe to mild).</w:t>
+      </w:r>
+    </w:p>
+    <w:p>
+      <w:pPr>
+        <w:numPr>
+          <w:ilvl w:val="0"/>
+          <w:numId w:val="1038"/>
+        </w:numPr>
+        <w:pStyle w:val="Compact"/>
+      </w:pPr>
+      <w:r>
+        <w:t xml:space="preserve">Missing documentation: every coded HCC is lost.</w:t>
+      </w:r>
+    </w:p>
+    <w:p>
+      <w:pPr>
+        <w:numPr>
+          <w:ilvl w:val="0"/>
+          <w:numId w:val="1038"/>
+        </w:numPr>
+        <w:pStyle w:val="Compact"/>
+      </w:pPr>
+      <w:r>
+        <w:t xml:space="preserve">HCCs supported by the record but not coded: underpayments.</w:t>
+      </w:r>
+    </w:p>
+    <w:p>
+      <w:pPr>
+        <w:numPr>
+          <w:ilvl w:val="0"/>
+          <w:numId w:val="1038"/>
+        </w:numPr>
+        <w:pStyle w:val="Compact"/>
+      </w:pPr>
+      <w:r>
+        <w:t xml:space="preserve">Calibrated to the FY 2025 Part C results: gross 6.09%, overpayments $21.43B, underpayments $2.23B, missing documentation 0.22%.</w:t>
+      </w:r>
+    </w:p>
+    <w:p>
+      <w:pPr>
+        <w:numPr>
+          <w:ilvl w:val="0"/>
+          <w:numId w:val="1038"/>
+        </w:numPr>
+        <w:pStyle w:val="Compact"/>
+      </w:pPr>
+      <w:r>
+        <w:t xml:space="preserve">The simulated truth is gross 6.06% ($23.57B).</w:t>
+      </w:r>
+    </w:p>
+    <w:p>
+      <w:pPr>
+        <w:pStyle w:val="FirstParagraph"/>
       </w:pPr>
       <w:r>
         <w:rPr>
@@ -12780,22 +12867,34 @@
         </w:rPr>
         <w:t xml:space="preserve">Estimators:</w:t>
       </w:r>
-      <w:r>
-        <w:t xml:space="preserve"> </w:t>
-      </w:r>
-      <w:r>
-        <w:t xml:space="preserve">- Expansion works in risk-score units: within each tercile, the mean over and under risk-score error × the tercile’s size × the national mean county rate × months.</w:t>
-      </w:r>
-      <w:r>
-        <w:t xml:space="preserve"> </w:t>
-      </w:r>
-      <w:r>
-        <w:t xml:space="preserve">- Ratio and regression use the enrollee payment.</w:t>
-      </w:r>
-    </w:p>
-    <w:p>
-      <w:pPr>
-        <w:pStyle w:val="BodyText"/>
+    </w:p>
+    <w:p>
+      <w:pPr>
+        <w:numPr>
+          <w:ilvl w:val="0"/>
+          <w:numId w:val="1039"/>
+        </w:numPr>
+        <w:pStyle w:val="Compact"/>
+      </w:pPr>
+      <w:r>
+        <w:t xml:space="preserve">Expansion works in risk-score units: within each tercile, the mean over and under risk-score error × the tercile’s size × the national mean county rate × months.</w:t>
+      </w:r>
+    </w:p>
+    <w:p>
+      <w:pPr>
+        <w:numPr>
+          <w:ilvl w:val="0"/>
+          <w:numId w:val="1039"/>
+        </w:numPr>
+        <w:pStyle w:val="Compact"/>
+      </w:pPr>
+      <w:r>
+        <w:t xml:space="preserve">Ratio and regression use the enrollee payment.</w:t>
+      </w:r>
+    </w:p>
+    <w:p>
+      <w:pPr>
+        <w:pStyle w:val="FirstParagraph"/>
       </w:pPr>
       <w:r>
         <w:rPr>
@@ -12804,23 +12903,41 @@
         </w:rPr>
         <w:t xml:space="preserve">Bootstrap simulation:</w:t>
       </w:r>
-      <w:r>
-        <w:t xml:space="preserve"> </w:t>
-      </w:r>
-      <w:r>
-        <w:t xml:space="preserve">- One failure rate per HCC (20). A failed audited instance is one that was deleted, moved, or on a record with missing documentation, and it loses its HCC’s mean audited loss.</w:t>
-      </w:r>
-      <w:r>
-        <w:t xml:space="preserve"> </w:t>
-      </w:r>
-      <w:r>
-        <w:t xml:space="preserve">- One addition rate per family (10).</w:t>
-      </w:r>
-      <w:r>
-        <w:t xml:space="preserve"> </w:t>
-      </w:r>
-      <w:r>
-        <w:t xml:space="preserve">- An HCC with no audited instance never fails. Rates are not extrapolated to unaudited HCCs.</w:t>
+    </w:p>
+    <w:p>
+      <w:pPr>
+        <w:numPr>
+          <w:ilvl w:val="0"/>
+          <w:numId w:val="1040"/>
+        </w:numPr>
+        <w:pStyle w:val="Compact"/>
+      </w:pPr>
+      <w:r>
+        <w:t xml:space="preserve">One failure rate per HCC (20). A failed audited instance is one that was deleted, moved, or on a record with missing documentation, and it loses its HCC’s mean audited loss.</w:t>
+      </w:r>
+    </w:p>
+    <w:p>
+      <w:pPr>
+        <w:numPr>
+          <w:ilvl w:val="0"/>
+          <w:numId w:val="1040"/>
+        </w:numPr>
+        <w:pStyle w:val="Compact"/>
+      </w:pPr>
+      <w:r>
+        <w:t xml:space="preserve">One addition rate per family (10).</w:t>
+      </w:r>
+    </w:p>
+    <w:p>
+      <w:pPr>
+        <w:numPr>
+          <w:ilvl w:val="0"/>
+          <w:numId w:val="1040"/>
+        </w:numPr>
+        <w:pStyle w:val="Compact"/>
+      </w:pPr>
+      <w:r>
+        <w:t xml:space="preserve">An HCC with no audited instance never fails. Rates are not extrapolated to unaudited HCCs.</w:t>
       </w:r>
     </w:p>
     <w:bookmarkEnd w:id="62"/>
@@ -12850,58 +12967,106 @@
       <w:r>
         <w:t xml:space="preserve">(108,000 beneficiaries × 500; about 4.5 million PDEs):</w:t>
       </w:r>
-      <w:r>
-        <w:t xml:space="preserve"> </w:t>
-      </w:r>
-      <w:r>
-        <w:t xml:space="preserve">- Gross drug cost (GDC) = ingredient cost + dispensing fee + sales tax + vaccine administration fee.</w:t>
-      </w:r>
-      <w:r>
-        <w:t xml:space="preserve"> </w:t>
-      </w:r>
-      <w:r>
-        <w:t xml:space="preserve">- 4% of beneficiaries are in long-term care (LTC) and fill about twice as many PDEs (illustrative).</w:t>
-      </w:r>
-      <w:r>
-        <w:t xml:space="preserve"> </w:t>
-      </w:r>
-      <w:r>
-        <w:t xml:space="preserve">- The CY 2025 post-IRA standard benefit is run on submitted and corrected PDEs:</w:t>
-      </w:r>
-      <w:r>
-        <w:t xml:space="preserve"> </w:t>
-      </w:r>
-      <w:r>
-        <w:t xml:space="preserve">- $590 deductible and $2,000 out-of-pocket cap;</w:t>
-      </w:r>
-      <w:r>
-        <w:t xml:space="preserve"> </w:t>
-      </w:r>
-      <w:r>
-        <w:t xml:space="preserve">- Manufacturer Discount Program;</w:t>
-      </w:r>
-      <w:r>
-        <w:t xml:space="preserve"> </w:t>
-      </w:r>
-      <w:r>
-        <w:t xml:space="preserve">- 20% and 40% reinsurance;</w:t>
-      </w:r>
-      <w:r>
-        <w:t xml:space="preserve"> </w:t>
-      </w:r>
-      <w:r>
-        <w:t xml:space="preserve">- low-income subsidy copays.</w:t>
-      </w:r>
-      <w:r>
-        <w:t xml:space="preserve"> </w:t>
-      </w:r>
-      <w:r>
-        <w:t xml:space="preserve">- Payments are direct subsidy + reinsurance + LICS, $105.56B in all.</w:t>
-      </w:r>
-    </w:p>
-    <w:p>
-      <w:pPr>
-        <w:pStyle w:val="BodyText"/>
+    </w:p>
+    <w:p>
+      <w:pPr>
+        <w:numPr>
+          <w:ilvl w:val="0"/>
+          <w:numId w:val="1041"/>
+        </w:numPr>
+        <w:pStyle w:val="Compact"/>
+      </w:pPr>
+      <w:r>
+        <w:t xml:space="preserve">Gross drug cost (GDC) = ingredient cost + dispensing fee + sales tax + vaccine administration fee.</w:t>
+      </w:r>
+    </w:p>
+    <w:p>
+      <w:pPr>
+        <w:numPr>
+          <w:ilvl w:val="0"/>
+          <w:numId w:val="1041"/>
+        </w:numPr>
+        <w:pStyle w:val="Compact"/>
+      </w:pPr>
+      <w:r>
+        <w:t xml:space="preserve">4% of beneficiaries are in long-term care (LTC) and fill about twice as many PDEs (illustrative).</w:t>
+      </w:r>
+    </w:p>
+    <w:p>
+      <w:pPr>
+        <w:numPr>
+          <w:ilvl w:val="0"/>
+          <w:numId w:val="1041"/>
+        </w:numPr>
+        <w:pStyle w:val="Compact"/>
+      </w:pPr>
+      <w:r>
+        <w:t xml:space="preserve">The CY 2025 post-IRA standard benefit is run on submitted and corrected PDEs:</w:t>
+      </w:r>
+    </w:p>
+    <w:p>
+      <w:pPr>
+        <w:numPr>
+          <w:ilvl w:val="1"/>
+          <w:numId w:val="1042"/>
+        </w:numPr>
+        <w:pStyle w:val="Compact"/>
+      </w:pPr>
+      <w:r>
+        <w:t xml:space="preserve">$590 deductible and $2,000 out-of-pocket cap;</w:t>
+      </w:r>
+    </w:p>
+    <w:p>
+      <w:pPr>
+        <w:numPr>
+          <w:ilvl w:val="1"/>
+          <w:numId w:val="1042"/>
+        </w:numPr>
+        <w:pStyle w:val="Compact"/>
+      </w:pPr>
+      <w:r>
+        <w:t xml:space="preserve">Manufacturer Discount Program;</w:t>
+      </w:r>
+    </w:p>
+    <w:p>
+      <w:pPr>
+        <w:numPr>
+          <w:ilvl w:val="1"/>
+          <w:numId w:val="1042"/>
+        </w:numPr>
+        <w:pStyle w:val="Compact"/>
+      </w:pPr>
+      <w:r>
+        <w:t xml:space="preserve">20% and 40% reinsurance;</w:t>
+      </w:r>
+    </w:p>
+    <w:p>
+      <w:pPr>
+        <w:numPr>
+          <w:ilvl w:val="1"/>
+          <w:numId w:val="1042"/>
+        </w:numPr>
+        <w:pStyle w:val="Compact"/>
+      </w:pPr>
+      <w:r>
+        <w:t xml:space="preserve">low-income subsidy copays.</w:t>
+      </w:r>
+    </w:p>
+    <w:p>
+      <w:pPr>
+        <w:numPr>
+          <w:ilvl w:val="0"/>
+          <w:numId w:val="1041"/>
+        </w:numPr>
+        <w:pStyle w:val="Compact"/>
+      </w:pPr>
+      <w:r>
+        <w:t xml:space="preserve">Payments are direct subsidy + reinsurance + LICS, $105.56B in all.</w:t>
+      </w:r>
+    </w:p>
+    <w:p>
+      <w:pPr>
+        <w:pStyle w:val="FirstParagraph"/>
       </w:pPr>
       <w:r>
         <w:rPr>
@@ -12910,34 +13075,58 @@
         </w:rPr>
         <w:t xml:space="preserve">Errors:</w:t>
       </w:r>
-      <w:r>
-        <w:t xml:space="preserve"> </w:t>
-      </w:r>
-      <w:r>
-        <w:t xml:space="preserve">- One candidate per PDE. 90% are full errors (GDC → 0) and 10% are partial, with the error share uniform on [−100%, 100%).</w:t>
-      </w:r>
-      <w:r>
-        <w:t xml:space="preserve"> </w:t>
-      </w:r>
-      <w:r>
-        <w:t xml:space="preserve">- Error probability is 10% for LTC PDEs and 2.5% for other PDEs (illustrative).</w:t>
-      </w:r>
-      <w:r>
-        <w:t xml:space="preserve"> </w:t>
-      </w:r>
-      <w:r>
-        <w:t xml:space="preserve">- No calibration: the truth is 1.38% gross ($1.46B).</w:t>
-      </w:r>
-      <w:r>
-        <w:t xml:space="preserve"> </w:t>
-      </w:r>
-      <w:r>
-        <w:t xml:space="preserve">- The FY 2025 Part D result was 4.00%, so this population tests the method at a lower error rate than production.</w:t>
-      </w:r>
-    </w:p>
-    <w:p>
-      <w:pPr>
-        <w:pStyle w:val="BodyText"/>
+    </w:p>
+    <w:p>
+      <w:pPr>
+        <w:numPr>
+          <w:ilvl w:val="0"/>
+          <w:numId w:val="1043"/>
+        </w:numPr>
+        <w:pStyle w:val="Compact"/>
+      </w:pPr>
+      <w:r>
+        <w:t xml:space="preserve">One candidate per PDE. 90% are full errors (GDC → 0) and 10% are partial, with the error share uniform on [−100%, 100%).</w:t>
+      </w:r>
+    </w:p>
+    <w:p>
+      <w:pPr>
+        <w:numPr>
+          <w:ilvl w:val="0"/>
+          <w:numId w:val="1043"/>
+        </w:numPr>
+        <w:pStyle w:val="Compact"/>
+      </w:pPr>
+      <w:r>
+        <w:t xml:space="preserve">Error probability is 10% for LTC PDEs and 2.5% for other PDEs (illustrative).</w:t>
+      </w:r>
+    </w:p>
+    <w:p>
+      <w:pPr>
+        <w:numPr>
+          <w:ilvl w:val="0"/>
+          <w:numId w:val="1043"/>
+        </w:numPr>
+        <w:pStyle w:val="Compact"/>
+      </w:pPr>
+      <w:r>
+        <w:t xml:space="preserve">No calibration: the truth is 1.38% gross ($1.46B).</w:t>
+      </w:r>
+    </w:p>
+    <w:p>
+      <w:pPr>
+        <w:numPr>
+          <w:ilvl w:val="0"/>
+          <w:numId w:val="1043"/>
+        </w:numPr>
+        <w:pStyle w:val="Compact"/>
+      </w:pPr>
+      <w:r>
+        <w:t xml:space="preserve">The FY 2025 Part D result was 4.00%, so this population tests the method at a lower error rate than production.</w:t>
+      </w:r>
+    </w:p>
+    <w:p>
+      <w:pPr>
+        <w:pStyle w:val="FirstParagraph"/>
       </w:pPr>
       <w:r>
         <w:rPr>
@@ -12946,34 +13135,58 @@
         </w:rPr>
         <w:t xml:space="preserve">Audits:</w:t>
       </w:r>
-      <w:r>
-        <w:t xml:space="preserve"> </w:t>
-      </w:r>
-      <w:r>
-        <w:t xml:space="preserve">- PDE audit of 5,000, in three strata: LTC; non-LTC in the lowest decile of GDC; other non-LTC. Neyman allocation.</w:t>
-      </w:r>
-      <w:r>
-        <w:t xml:space="preserve"> </w:t>
-      </w:r>
-      <w:r>
-        <w:t xml:space="preserve">- Used by expansion and by the bootstrap simulation.</w:t>
-      </w:r>
-      <w:r>
-        <w:t xml:space="preserve"> </w:t>
-      </w:r>
-      <w:r>
-        <w:t xml:space="preserve">- Expansion applies each stratum’s audited error rate to every PDE in the stratum and reruns the benefit. Its interval is a delta-method interval: each stratum rate is moved ±1 SE and the benefit rerun each way.</w:t>
-      </w:r>
-      <w:r>
-        <w:t xml:space="preserve"> </w:t>
-      </w:r>
-      <w:r>
-        <w:t xml:space="preserve">- Beneficiary audit: an SRS of 990 beneficiaries with every PDE reviewed. Used by ratio and regression.</w:t>
-      </w:r>
-    </w:p>
-    <w:p>
-      <w:pPr>
-        <w:pStyle w:val="BodyText"/>
+    </w:p>
+    <w:p>
+      <w:pPr>
+        <w:numPr>
+          <w:ilvl w:val="0"/>
+          <w:numId w:val="1044"/>
+        </w:numPr>
+        <w:pStyle w:val="Compact"/>
+      </w:pPr>
+      <w:r>
+        <w:t xml:space="preserve">PDE audit of 5,000, in three strata: LTC; non-LTC in the lowest decile of GDC; other non-LTC. Neyman allocation.</w:t>
+      </w:r>
+    </w:p>
+    <w:p>
+      <w:pPr>
+        <w:numPr>
+          <w:ilvl w:val="1"/>
+          <w:numId w:val="1045"/>
+        </w:numPr>
+        <w:pStyle w:val="Compact"/>
+      </w:pPr>
+      <w:r>
+        <w:t xml:space="preserve">Used by expansion and by the bootstrap simulation.</w:t>
+      </w:r>
+    </w:p>
+    <w:p>
+      <w:pPr>
+        <w:numPr>
+          <w:ilvl w:val="1"/>
+          <w:numId w:val="1045"/>
+        </w:numPr>
+        <w:pStyle w:val="Compact"/>
+      </w:pPr>
+      <w:r>
+        <w:t xml:space="preserve">Expansion applies each stratum’s audited error rate to every PDE in the stratum and reruns the benefit. Its interval is a delta-method interval: each stratum rate is moved ±1 SE and the benefit rerun each way.</w:t>
+      </w:r>
+    </w:p>
+    <w:p>
+      <w:pPr>
+        <w:numPr>
+          <w:ilvl w:val="0"/>
+          <w:numId w:val="1044"/>
+        </w:numPr>
+        <w:pStyle w:val="Compact"/>
+      </w:pPr>
+      <w:r>
+        <w:t xml:space="preserve">Beneficiary audit: an SRS of 990 beneficiaries with every PDE reviewed. Used by ratio and regression.</w:t>
+      </w:r>
+    </w:p>
+    <w:p>
+      <w:pPr>
+        <w:pStyle w:val="FirstParagraph"/>
       </w:pPr>
       <w:r>
         <w:t xml:space="preserve">The two audits differ, so the comparison between methods is between designs as well as estimators.</w:t>
@@ -13006,17 +13219,29 @@
       <w:r>
         <w:t xml:space="preserve">(9 states, 3.09 million payments × 200; 264,565 beneficiaries):</w:t>
       </w:r>
-      <w:r>
-        <w:t xml:space="preserve"> </w:t>
-      </w:r>
-      <w:r>
-        <w:t xml:space="preserve">- FFS claims and monthly managed-care capitations.</w:t>
-      </w:r>
-      <w:r>
-        <w:t xml:space="preserve"> </w:t>
-      </w:r>
-      <w:r>
-        <w:t xml:space="preserve">- Rates are measured at federal share, Σ</w:t>
+    </w:p>
+    <w:p>
+      <w:pPr>
+        <w:numPr>
+          <w:ilvl w:val="0"/>
+          <w:numId w:val="1046"/>
+        </w:numPr>
+        <w:pStyle w:val="Compact"/>
+      </w:pPr>
+      <w:r>
+        <w:t xml:space="preserve">FFS claims and monthly managed-care capitations.</w:t>
+      </w:r>
+    </w:p>
+    <w:p>
+      <w:pPr>
+        <w:numPr>
+          <w:ilvl w:val="0"/>
+          <w:numId w:val="1046"/>
+        </w:numPr>
+        <w:pStyle w:val="Compact"/>
+      </w:pPr>
+      <w:r>
+        <w:t xml:space="preserve">Rates are measured at federal share, Σ</w:t>
       </w:r>
       <w:r>
         <w:rPr>
@@ -13041,7 +13266,7 @@
     </w:p>
     <w:p>
       <w:pPr>
-        <w:pStyle w:val="BodyText"/>
+        <w:pStyle w:val="FirstParagraph"/>
       </w:pPr>
       <w:r>
         <w:rPr>
@@ -13050,34 +13275,58 @@
         </w:rPr>
         <w:t xml:space="preserve">Errors:</w:t>
       </w:r>
-      <w:r>
-        <w:t xml:space="preserve"> </w:t>
-      </w:r>
-      <w:r>
-        <w:t xml:space="preserve">- Claims-review errors: FFS 6.5% of payments (70% all-or-nothing, 30% partial); MC 0.3%.</w:t>
-      </w:r>
-      <w:r>
-        <w:t xml:space="preserve"> </w:t>
-      </w:r>
-      <w:r>
-        <w:t xml:space="preserve">- Eligibility errors, set beneficiary by beneficiary. Each state’s true rate is set on a grid from 2.00% to 4.00%.</w:t>
-      </w:r>
-      <w:r>
-        <w:t xml:space="preserve"> </w:t>
-      </w:r>
-      <w:r>
-        <w:t xml:space="preserve">- Gross = the whole payment if eligibility is in error, otherwise the claims error.</w:t>
-      </w:r>
-      <w:r>
-        <w:t xml:space="preserve"> </w:t>
-      </w:r>
-      <w:r>
-        <w:t xml:space="preserve">- Calibrated to the Medicaid FY 2025 rate of 6.12%; the simulated truth is 6.09%.</w:t>
-      </w:r>
-    </w:p>
-    <w:p>
-      <w:pPr>
-        <w:pStyle w:val="BodyText"/>
+    </w:p>
+    <w:p>
+      <w:pPr>
+        <w:numPr>
+          <w:ilvl w:val="0"/>
+          <w:numId w:val="1047"/>
+        </w:numPr>
+        <w:pStyle w:val="Compact"/>
+      </w:pPr>
+      <w:r>
+        <w:t xml:space="preserve">Claims-review errors: FFS 6.5% of payments (70% all-or-nothing, 30% partial); MC 0.3%.</w:t>
+      </w:r>
+    </w:p>
+    <w:p>
+      <w:pPr>
+        <w:numPr>
+          <w:ilvl w:val="0"/>
+          <w:numId w:val="1047"/>
+        </w:numPr>
+        <w:pStyle w:val="Compact"/>
+      </w:pPr>
+      <w:r>
+        <w:t xml:space="preserve">Eligibility errors, set beneficiary by beneficiary. Each state’s true rate is set on a grid from 2.00% to 4.00%.</w:t>
+      </w:r>
+    </w:p>
+    <w:p>
+      <w:pPr>
+        <w:numPr>
+          <w:ilvl w:val="0"/>
+          <w:numId w:val="1047"/>
+        </w:numPr>
+        <w:pStyle w:val="Compact"/>
+      </w:pPr>
+      <w:r>
+        <w:t xml:space="preserve">Gross = the whole payment if eligibility is in error, otherwise the claims error.</w:t>
+      </w:r>
+    </w:p>
+    <w:p>
+      <w:pPr>
+        <w:numPr>
+          <w:ilvl w:val="0"/>
+          <w:numId w:val="1047"/>
+        </w:numPr>
+        <w:pStyle w:val="Compact"/>
+      </w:pPr>
+      <w:r>
+        <w:t xml:space="preserve">Calibrated to the Medicaid FY 2025 rate of 6.12%; the simulated truth is 6.09%.</w:t>
+      </w:r>
+    </w:p>
+    <w:p>
+      <w:pPr>
+        <w:pStyle w:val="FirstParagraph"/>
       </w:pPr>
       <w:r>
         <w:rPr>
@@ -13086,40 +13335,70 @@
         </w:rPr>
         <w:t xml:space="preserve">Audit:</w:t>
       </w:r>
-      <w:r>
-        <w:t xml:space="preserve"> </w:t>
-      </w:r>
-      <w:r>
-        <w:t xml:space="preserve">- Strata within each state: payment type (FFS, MC) × five equal-count payment quintiles (10 strata).</w:t>
-      </w:r>
-      <w:r>
-        <w:t xml:space="preserve"> </w:t>
-      </w:r>
-      <w:r>
-        <w:t xml:space="preserve">- Neyman allocation of 520 payments per state-year, with systematic selection after sorting by amount within stratum.</w:t>
-      </w:r>
-      <w:r>
-        <w:t xml:space="preserve"> </w:t>
-      </w:r>
-      <w:r>
-        <w:t xml:space="preserve">- National pooling:</w:t>
-      </w:r>
-      <w:r>
-        <w:t xml:space="preserve"> </w:t>
-      </w:r>
-      <w:r>
-        <w:t xml:space="preserve">- Analytic methods add the state dollar totals and variances.</w:t>
-      </w:r>
-      <w:r>
-        <w:t xml:space="preserve"> </w:t>
-      </w:r>
-      <w:r>
-        <w:t xml:space="preserve">- The bootstrap simulation sums the states’ iteration totals iteration by iteration.</w:t>
-      </w:r>
-    </w:p>
-    <w:p>
-      <w:pPr>
-        <w:pStyle w:val="BodyText"/>
+    </w:p>
+    <w:p>
+      <w:pPr>
+        <w:numPr>
+          <w:ilvl w:val="0"/>
+          <w:numId w:val="1048"/>
+        </w:numPr>
+        <w:pStyle w:val="Compact"/>
+      </w:pPr>
+      <w:r>
+        <w:t xml:space="preserve">Strata within each state: payment type (FFS, MC) × five equal-count payment quintiles (10 strata).</w:t>
+      </w:r>
+    </w:p>
+    <w:p>
+      <w:pPr>
+        <w:numPr>
+          <w:ilvl w:val="0"/>
+          <w:numId w:val="1048"/>
+        </w:numPr>
+        <w:pStyle w:val="Compact"/>
+      </w:pPr>
+      <w:r>
+        <w:t xml:space="preserve">Neyman allocation of 520 payments per state-year, with systematic selection after sorting by amount within stratum.</w:t>
+      </w:r>
+    </w:p>
+    <w:p>
+      <w:pPr>
+        <w:numPr>
+          <w:ilvl w:val="0"/>
+          <w:numId w:val="1048"/>
+        </w:numPr>
+        <w:pStyle w:val="Compact"/>
+      </w:pPr>
+      <w:r>
+        <w:t xml:space="preserve">National pooling:</w:t>
+      </w:r>
+    </w:p>
+    <w:p>
+      <w:pPr>
+        <w:numPr>
+          <w:ilvl w:val="1"/>
+          <w:numId w:val="1049"/>
+        </w:numPr>
+        <w:pStyle w:val="Compact"/>
+      </w:pPr>
+      <w:r>
+        <w:t xml:space="preserve">Analytic methods add the state dollar totals and variances.</w:t>
+      </w:r>
+    </w:p>
+    <w:p>
+      <w:pPr>
+        <w:numPr>
+          <w:ilvl w:val="1"/>
+          <w:numId w:val="1049"/>
+        </w:numPr>
+        <w:pStyle w:val="Compact"/>
+      </w:pPr>
+      <w:r>
+        <w:t xml:space="preserve">The bootstrap simulation sums the states’ iteration totals iteration by iteration.</w:t>
+      </w:r>
+    </w:p>
+    <w:p>
+      <w:pPr>
+        <w:pStyle w:val="FirstParagraph"/>
       </w:pPr>
       <w:r>
         <w:rPr>
@@ -13128,17 +13407,29 @@
         </w:rPr>
         <w:t xml:space="preserve">Bootstrap simulation:</w:t>
       </w:r>
-      <w:r>
-        <w:t xml:space="preserve"> </w:t>
-      </w:r>
-      <w:r>
-        <w:t xml:space="preserve">- Claims findings are matched within the payment stratum.</w:t>
-      </w:r>
-      <w:r>
-        <w:t xml:space="preserve"> </w:t>
-      </w:r>
-      <w:r>
-        <w:t xml:space="preserve">- The eligibility error rate is taken from the audited beneficiaries of the state.</w:t>
+    </w:p>
+    <w:p>
+      <w:pPr>
+        <w:numPr>
+          <w:ilvl w:val="0"/>
+          <w:numId w:val="1050"/>
+        </w:numPr>
+        <w:pStyle w:val="Compact"/>
+      </w:pPr>
+      <w:r>
+        <w:t xml:space="preserve">Claims findings are matched within the payment stratum.</w:t>
+      </w:r>
+    </w:p>
+    <w:p>
+      <w:pPr>
+        <w:numPr>
+          <w:ilvl w:val="0"/>
+          <w:numId w:val="1050"/>
+        </w:numPr>
+        <w:pStyle w:val="Compact"/>
+      </w:pPr>
+      <w:r>
+        <w:t xml:space="preserve">The eligibility error rate is taken from the audited beneficiaries of the state.</w:t>
       </w:r>
     </w:p>
     <w:bookmarkEnd w:id="64"/>
@@ -13168,28 +13459,46 @@
       <w:r>
         <w:t xml:space="preserve">(142,152 applications × 100):</w:t>
       </w:r>
-      <w:r>
-        <w:t xml:space="preserve"> </w:t>
-      </w:r>
-      <w:r>
-        <w:t xml:space="preserve">- Households with income, size, age and benchmark premium.</w:t>
-      </w:r>
-      <w:r>
-        <w:t xml:space="preserve"> </w:t>
-      </w:r>
-      <w:r>
-        <w:t xml:space="preserve">- APTC under the enhanced applicable-percentage schedule for 2021–2025.</w:t>
-      </w:r>
-      <w:r>
-        <w:t xml:space="preserve"> </w:t>
-      </w:r>
-      <w:r>
-        <w:t xml:space="preserve">- APTC recipients only.</w:t>
-      </w:r>
-    </w:p>
-    <w:p>
-      <w:pPr>
-        <w:pStyle w:val="BodyText"/>
+    </w:p>
+    <w:p>
+      <w:pPr>
+        <w:numPr>
+          <w:ilvl w:val="0"/>
+          <w:numId w:val="1051"/>
+        </w:numPr>
+        <w:pStyle w:val="Compact"/>
+      </w:pPr>
+      <w:r>
+        <w:t xml:space="preserve">Households with income, size, age and benchmark premium.</w:t>
+      </w:r>
+    </w:p>
+    <w:p>
+      <w:pPr>
+        <w:numPr>
+          <w:ilvl w:val="0"/>
+          <w:numId w:val="1051"/>
+        </w:numPr>
+        <w:pStyle w:val="Compact"/>
+      </w:pPr>
+      <w:r>
+        <w:t xml:space="preserve">APTC under the enhanced applicable-percentage schedule for 2021–2025.</w:t>
+      </w:r>
+    </w:p>
+    <w:p>
+      <w:pPr>
+        <w:numPr>
+          <w:ilvl w:val="0"/>
+          <w:numId w:val="1051"/>
+        </w:numPr>
+        <w:pStyle w:val="Compact"/>
+      </w:pPr>
+      <w:r>
+        <w:t xml:space="preserve">APTC recipients only.</w:t>
+      </w:r>
+    </w:p>
+    <w:p>
+      <w:pPr>
+        <w:pStyle w:val="FirstParagraph"/>
       </w:pPr>
       <w:r>
         <w:rPr>
@@ -13198,21 +13507,27 @@
         </w:rPr>
         <w:t xml:space="preserve">Errors:</w:t>
       </w:r>
-      <w:r>
-        <w:t xml:space="preserve"> </w:t>
-      </w:r>
-      <w:r>
-        <w:t xml:space="preserve">- FY 2023–2025 public results report no underpayments, so every error is an overpayment.</w:t>
-      </w:r>
-      <w:r>
-        <w:t xml:space="preserve"> </w:t>
-      </w:r>
-      <w:r>
-        <w:t xml:space="preserve">-</w:t>
-      </w:r>
-      <w:r>
-        <w:t xml:space="preserve"> </w:t>
-      </w:r>
+    </w:p>
+    <w:p>
+      <w:pPr>
+        <w:numPr>
+          <w:ilvl w:val="0"/>
+          <w:numId w:val="1052"/>
+        </w:numPr>
+        <w:pStyle w:val="Compact"/>
+      </w:pPr>
+      <w:r>
+        <w:t xml:space="preserve">FY 2023–2025 public results report no underpayments, so every error is an overpayment.</w:t>
+      </w:r>
+    </w:p>
+    <w:p>
+      <w:pPr>
+        <w:numPr>
+          <w:ilvl w:val="0"/>
+          <w:numId w:val="1052"/>
+        </w:numPr>
+        <w:pStyle w:val="Compact"/>
+      </w:pPr>
       <w:r>
         <w:rPr>
           <w:iCs/>
@@ -13226,15 +13541,15 @@
       <w:r>
         <w:t xml:space="preserve">errors: a required data match was not run, so the whole APTC is improper. 48% of improper dollars, matching FY 2025 (0.43 of 0.89 points).</w:t>
       </w:r>
-      <w:r>
-        <w:t xml:space="preserve"> </w:t>
-      </w:r>
-      <w:r>
-        <w:t xml:space="preserve">-</w:t>
-      </w:r>
-      <w:r>
-        <w:t xml:space="preserve"> </w:t>
-      </w:r>
+    </w:p>
+    <w:p>
+      <w:pPr>
+        <w:numPr>
+          <w:ilvl w:val="0"/>
+          <w:numId w:val="1052"/>
+        </w:numPr>
+        <w:pStyle w:val="Compact"/>
+      </w:pPr>
       <w:r>
         <w:rPr>
           <w:iCs/>
@@ -13248,16 +13563,22 @@
       <w:r>
         <w:t xml:space="preserve">errors: the supported income is higher than the income used, by a lognormal factor, and APTC is recomputed. 52% of improper dollars.</w:t>
       </w:r>
-      <w:r>
-        <w:t xml:space="preserve"> </w:t>
-      </w:r>
-      <w:r>
-        <w:t xml:space="preserve">- The simulated truth is 0.92% gross, including technical 0.43%.</w:t>
-      </w:r>
-    </w:p>
-    <w:p>
-      <w:pPr>
-        <w:pStyle w:val="BodyText"/>
+    </w:p>
+    <w:p>
+      <w:pPr>
+        <w:numPr>
+          <w:ilvl w:val="0"/>
+          <w:numId w:val="1052"/>
+        </w:numPr>
+        <w:pStyle w:val="Compact"/>
+      </w:pPr>
+      <w:r>
+        <w:t xml:space="preserve">The simulated truth is 0.92% gross, including technical 0.43%.</w:t>
+      </w:r>
+    </w:p>
+    <w:p>
+      <w:pPr>
+        <w:pStyle w:val="FirstParagraph"/>
       </w:pPr>
       <w:r>
         <w:rPr>
@@ -13266,11 +13587,17 @@
         </w:rPr>
         <w:t xml:space="preserve">Audit:</w:t>
       </w:r>
-      <w:r>
-        <w:t xml:space="preserve"> </w:t>
-      </w:r>
-      <w:r>
-        <w:t xml:space="preserve">- Stratified SRS of 2,000 applications, matching CMS’s</w:t>
+    </w:p>
+    <w:p>
+      <w:pPr>
+        <w:numPr>
+          <w:ilvl w:val="0"/>
+          <w:numId w:val="1053"/>
+        </w:numPr>
+        <w:pStyle w:val="Compact"/>
+      </w:pPr>
+      <w:r>
+        <w:t xml:space="preserve">Stratified SRS of 2,000 applications, matching CMS’s</w:t>
       </w:r>
       <w:r>
         <w:t xml:space="preserve"> </w:t>
@@ -13287,16 +13614,22 @@
       <w:r>
         <w:t xml:space="preserve">.</w:t>
       </w:r>
-      <w:r>
-        <w:t xml:space="preserve"> </w:t>
-      </w:r>
-      <w:r>
-        <w:t xml:space="preserve">- Strata are five equal-count quintiles of annual APTC (illustrative; the EIPM strata are not public), with Neyman allocation.</w:t>
-      </w:r>
-    </w:p>
-    <w:p>
-      <w:pPr>
-        <w:pStyle w:val="BodyText"/>
+    </w:p>
+    <w:p>
+      <w:pPr>
+        <w:numPr>
+          <w:ilvl w:val="0"/>
+          <w:numId w:val="1053"/>
+        </w:numPr>
+        <w:pStyle w:val="Compact"/>
+      </w:pPr>
+      <w:r>
+        <w:t xml:space="preserve">Strata are five equal-count quintiles of annual APTC (illustrative; the EIPM strata are not public), with Neyman allocation.</w:t>
+      </w:r>
+    </w:p>
+    <w:p>
+      <w:pPr>
+        <w:pStyle w:val="FirstParagraph"/>
       </w:pPr>
       <w:r>
         <w:rPr>
@@ -13305,17 +13638,29 @@
         </w:rPr>
         <w:t xml:space="preserve">Bootstrap simulation:</w:t>
       </w:r>
-      <w:r>
-        <w:t xml:space="preserve"> </w:t>
-      </w:r>
-      <w:r>
-        <w:t xml:space="preserve">- Within each quintile, an error is technical or monetary at the audited shares.</w:t>
-      </w:r>
-      <w:r>
-        <w:t xml:space="preserve"> </w:t>
-      </w:r>
-      <w:r>
-        <w:t xml:space="preserve">- A monetary error transfers the donor’s ratio of supported to used income, and APTC is recomputed for the recipient, clipped to 100–600% FPL.</w:t>
+    </w:p>
+    <w:p>
+      <w:pPr>
+        <w:numPr>
+          <w:ilvl w:val="0"/>
+          <w:numId w:val="1054"/>
+        </w:numPr>
+        <w:pStyle w:val="Compact"/>
+      </w:pPr>
+      <w:r>
+        <w:t xml:space="preserve">Within each quintile, an error is technical or monetary at the audited shares.</w:t>
+      </w:r>
+    </w:p>
+    <w:p>
+      <w:pPr>
+        <w:numPr>
+          <w:ilvl w:val="0"/>
+          <w:numId w:val="1054"/>
+        </w:numPr>
+        <w:pStyle w:val="Compact"/>
+      </w:pPr>
+      <w:r>
+        <w:t xml:space="preserve">A monetary error transfers the donor’s ratio of supported to used income, and APTC is recomputed for the recipient, clipped to 100–600% FPL.</w:t>
       </w:r>
     </w:p>
     <w:bookmarkEnd w:id="65"/>
@@ -13556,7 +13901,7 @@
       <w:pPr>
         <w:numPr>
           <w:ilvl w:val="0"/>
-          <w:numId w:val="1035"/>
+          <w:numId w:val="1055"/>
         </w:numPr>
         <w:pStyle w:val="Compact"/>
       </w:pPr>
@@ -13568,7 +13913,7 @@
       <w:pPr>
         <w:numPr>
           <w:ilvl w:val="0"/>
-          <w:numId w:val="1035"/>
+          <w:numId w:val="1055"/>
         </w:numPr>
         <w:pStyle w:val="Compact"/>
       </w:pPr>
@@ -13587,46 +13932,82 @@
         </w:rPr>
         <w:t xml:space="preserve">Errors:</w:t>
       </w:r>
-      <w:r>
-        <w:t xml:space="preserve"> </w:t>
-      </w:r>
-      <w:r>
-        <w:t xml:space="preserve">- At most one error per claim.</w:t>
-      </w:r>
-      <w:r>
-        <w:t xml:space="preserve"> </w:t>
-      </w:r>
-      <w:r>
-        <w:t xml:space="preserve">- Whole-claim overpayments: no or insufficient documentation, medical necessity, other. These are 92% of overpayment dollars.</w:t>
-      </w:r>
-      <w:r>
-        <w:t xml:space="preserve"> </w:t>
-      </w:r>
-      <w:r>
-        <w:t xml:space="preserve">- Partial coding overpayments: 8% of overpayment dollars, sized 5–60% of the payment.</w:t>
-      </w:r>
-      <w:r>
-        <w:t xml:space="preserve"> </w:t>
-      </w:r>
-      <w:r>
-        <w:t xml:space="preserve">- Coding underpayments: 5–50% of the payment.</w:t>
-      </w:r>
-      <w:r>
-        <w:t xml:space="preserve"> </w:t>
-      </w:r>
-      <w:r>
-        <w:t xml:space="preserve">- Per-type rates are closed form, from FY 2025 overpayment and underpayment dollars (Supplemental Improper Payment Data, Tables A1 and A4).</w:t>
-      </w:r>
-      <w:r>
-        <w:t xml:space="preserve"> </w:t>
-      </w:r>
-      <w:r>
-        <w:t xml:space="preserve">- The simulated truth is 6.50% gross (FY 2025: 6.55%), with $0.92B in underpayments (FY 2025: $1.0B).</w:t>
-      </w:r>
-    </w:p>
-    <w:p>
-      <w:pPr>
-        <w:pStyle w:val="BodyText"/>
+    </w:p>
+    <w:p>
+      <w:pPr>
+        <w:numPr>
+          <w:ilvl w:val="0"/>
+          <w:numId w:val="1056"/>
+        </w:numPr>
+        <w:pStyle w:val="Compact"/>
+      </w:pPr>
+      <w:r>
+        <w:t xml:space="preserve">At most one error per claim.</w:t>
+      </w:r>
+    </w:p>
+    <w:p>
+      <w:pPr>
+        <w:numPr>
+          <w:ilvl w:val="0"/>
+          <w:numId w:val="1056"/>
+        </w:numPr>
+        <w:pStyle w:val="Compact"/>
+      </w:pPr>
+      <w:r>
+        <w:t xml:space="preserve">Whole-claim overpayments: no or insufficient documentation, medical necessity, other. These are 92% of overpayment dollars.</w:t>
+      </w:r>
+    </w:p>
+    <w:p>
+      <w:pPr>
+        <w:numPr>
+          <w:ilvl w:val="0"/>
+          <w:numId w:val="1056"/>
+        </w:numPr>
+        <w:pStyle w:val="Compact"/>
+      </w:pPr>
+      <w:r>
+        <w:t xml:space="preserve">Partial coding overpayments: 8% of overpayment dollars, sized 5–60% of the payment.</w:t>
+      </w:r>
+    </w:p>
+    <w:p>
+      <w:pPr>
+        <w:numPr>
+          <w:ilvl w:val="0"/>
+          <w:numId w:val="1056"/>
+        </w:numPr>
+        <w:pStyle w:val="Compact"/>
+      </w:pPr>
+      <w:r>
+        <w:t xml:space="preserve">Coding underpayments: 5–50% of the payment.</w:t>
+      </w:r>
+    </w:p>
+    <w:p>
+      <w:pPr>
+        <w:numPr>
+          <w:ilvl w:val="0"/>
+          <w:numId w:val="1056"/>
+        </w:numPr>
+        <w:pStyle w:val="Compact"/>
+      </w:pPr>
+      <w:r>
+        <w:t xml:space="preserve">Per-type rates are closed form, from FY 2025 overpayment and underpayment dollars (Supplemental Improper Payment Data, Tables A1 and A4).</w:t>
+      </w:r>
+    </w:p>
+    <w:p>
+      <w:pPr>
+        <w:numPr>
+          <w:ilvl w:val="0"/>
+          <w:numId w:val="1056"/>
+        </w:numPr>
+        <w:pStyle w:val="Compact"/>
+      </w:pPr>
+      <w:r>
+        <w:t xml:space="preserve">The simulated truth is 6.50% gross (FY 2025: 6.55%), with $0.92B in underpayments (FY 2025: $1.0B).</w:t>
+      </w:r>
+    </w:p>
+    <w:p>
+      <w:pPr>
+        <w:pStyle w:val="FirstParagraph"/>
       </w:pPr>
       <w:r>
         <w:rPr>
@@ -13635,29 +14016,53 @@
         </w:rPr>
         <w:t xml:space="preserve">Audit:</w:t>
       </w:r>
-      <w:r>
-        <w:t xml:space="preserve"> </w:t>
-      </w:r>
-      <w:r>
-        <w:t xml:space="preserve">- 37,651 claims, the FY 2025 count of claims reviewed per claim type: IPPS 8,750; Part A excluding IPPS 8,651; Part B 11,600; DMEPOS 8,650.</w:t>
-      </w:r>
-      <w:r>
-        <w:t xml:space="preserve"> </w:t>
-      </w:r>
-      <w:r>
-        <w:t xml:space="preserve">- Neyman allocation across five equal-count payment quintiles within each type. These stand in for CERT’s roughly 100 service-level strata per type, which cannot be rebuilt from public data.</w:t>
-      </w:r>
-      <w:r>
-        <w:t xml:space="preserve"> </w:t>
-      </w:r>
-      <w:r>
-        <w:t xml:space="preserve">- The production estimator reduces nationally to a separate ratio estimator.</w:t>
-      </w:r>
-      <w:r>
-        <w:t xml:space="preserve"> </w:t>
-      </w:r>
-      <w:r>
-        <w:t xml:space="preserve">- The Part A-to-B rebilling adjustment is out of scope.</w:t>
+    </w:p>
+    <w:p>
+      <w:pPr>
+        <w:numPr>
+          <w:ilvl w:val="0"/>
+          <w:numId w:val="1057"/>
+        </w:numPr>
+        <w:pStyle w:val="Compact"/>
+      </w:pPr>
+      <w:r>
+        <w:t xml:space="preserve">37,651 claims, the FY 2025 count of claims reviewed per claim type: IPPS 8,750; Part A excluding IPPS 8,651; Part B 11,600; DMEPOS 8,650.</w:t>
+      </w:r>
+    </w:p>
+    <w:p>
+      <w:pPr>
+        <w:numPr>
+          <w:ilvl w:val="0"/>
+          <w:numId w:val="1057"/>
+        </w:numPr>
+        <w:pStyle w:val="Compact"/>
+      </w:pPr>
+      <w:r>
+        <w:t xml:space="preserve">Neyman allocation across five equal-count payment quintiles within each type. These stand in for CERT’s roughly 100 service-level strata per type, which cannot be rebuilt from public data.</w:t>
+      </w:r>
+    </w:p>
+    <w:p>
+      <w:pPr>
+        <w:numPr>
+          <w:ilvl w:val="0"/>
+          <w:numId w:val="1057"/>
+        </w:numPr>
+        <w:pStyle w:val="Compact"/>
+      </w:pPr>
+      <w:r>
+        <w:t xml:space="preserve">The production estimator reduces nationally to a separate ratio estimator.</w:t>
+      </w:r>
+    </w:p>
+    <w:p>
+      <w:pPr>
+        <w:numPr>
+          <w:ilvl w:val="0"/>
+          <w:numId w:val="1057"/>
+        </w:numPr>
+        <w:pStyle w:val="Compact"/>
+      </w:pPr>
+      <w:r>
+        <w:t xml:space="preserve">The Part A-to-B rebilling adjustment is out of scope.</w:t>
       </w:r>
     </w:p>
     <w:bookmarkEnd w:id="66"/>
@@ -13674,7 +14079,7 @@
       <w:pPr>
         <w:numPr>
           <w:ilvl w:val="0"/>
-          <w:numId w:val="1036"/>
+          <w:numId w:val="1058"/>
         </w:numPr>
         <w:pStyle w:val="Compact"/>
       </w:pPr>
@@ -13696,7 +14101,7 @@
       <w:pPr>
         <w:numPr>
           <w:ilvl w:val="0"/>
-          <w:numId w:val="1036"/>
+          <w:numId w:val="1058"/>
         </w:numPr>
         <w:pStyle w:val="Compact"/>
       </w:pPr>
@@ -13718,7 +14123,7 @@
       <w:pPr>
         <w:numPr>
           <w:ilvl w:val="0"/>
-          <w:numId w:val="1036"/>
+          <w:numId w:val="1058"/>
         </w:numPr>
         <w:pStyle w:val="Compact"/>
       </w:pPr>
@@ -13740,7 +14145,7 @@
       <w:pPr>
         <w:numPr>
           <w:ilvl w:val="0"/>
-          <w:numId w:val="1036"/>
+          <w:numId w:val="1058"/>
         </w:numPr>
         <w:pStyle w:val="Compact"/>
       </w:pPr>
@@ -13762,7 +14167,7 @@
       <w:pPr>
         <w:numPr>
           <w:ilvl w:val="0"/>
-          <w:numId w:val="1036"/>
+          <w:numId w:val="1058"/>
         </w:numPr>
         <w:pStyle w:val="Compact"/>
       </w:pPr>
@@ -13784,7 +14189,7 @@
       <w:pPr>
         <w:numPr>
           <w:ilvl w:val="0"/>
-          <w:numId w:val="1036"/>
+          <w:numId w:val="1058"/>
         </w:numPr>
         <w:pStyle w:val="Compact"/>
       </w:pPr>
@@ -15972,6 +16377,12 @@
     <w:abstractNumId w:val="991"/>
   </w:num>
   <w:num w:numId="1005">
+    <w:abstractNumId w:val="991"/>
+  </w:num>
+  <w:num w:numId="1006">
+    <w:abstractNumId w:val="991"/>
+  </w:num>
+  <w:num w:numId="1007">
     <w:abstractNumId w:val="99411"/>
     <w:lvlOverride w:ilvl="0">
       <w:startOverride w:val="1"/>
@@ -16001,7 +16412,7 @@
       <w:startOverride w:val="1"/>
     </w:lvlOverride>
   </w:num>
-  <w:num w:numId="1006">
+  <w:num w:numId="1008">
     <w:abstractNumId w:val="99411"/>
     <w:lvlOverride w:ilvl="0">
       <w:startOverride w:val="1"/>
@@ -16031,12 +16442,6 @@
       <w:startOverride w:val="1"/>
     </w:lvlOverride>
   </w:num>
-  <w:num w:numId="1007">
-    <w:abstractNumId w:val="991"/>
-  </w:num>
-  <w:num w:numId="1008">
-    <w:abstractNumId w:val="991"/>
-  </w:num>
   <w:num w:numId="1009">
     <w:abstractNumId w:val="991"/>
   </w:num>
@@ -16047,6 +16452,12 @@
     <w:abstractNumId w:val="991"/>
   </w:num>
   <w:num w:numId="1012">
+    <w:abstractNumId w:val="991"/>
+  </w:num>
+  <w:num w:numId="1013">
+    <w:abstractNumId w:val="991"/>
+  </w:num>
+  <w:num w:numId="1014">
     <w:abstractNumId w:val="99411"/>
     <w:lvlOverride w:ilvl="0">
       <w:startOverride w:val="1"/>
@@ -16076,12 +16487,6 @@
       <w:startOverride w:val="1"/>
     </w:lvlOverride>
   </w:num>
-  <w:num w:numId="1013">
-    <w:abstractNumId w:val="991"/>
-  </w:num>
-  <w:num w:numId="1014">
-    <w:abstractNumId w:val="991"/>
-  </w:num>
   <w:num w:numId="1015">
     <w:abstractNumId w:val="991"/>
   </w:num>
@@ -16095,34 +16500,7 @@
     <w:abstractNumId w:val="991"/>
   </w:num>
   <w:num w:numId="1019">
-    <w:abstractNumId w:val="99411"/>
-    <w:lvlOverride w:ilvl="0">
-      <w:startOverride w:val="1"/>
-    </w:lvlOverride>
-    <w:lvlOverride w:ilvl="1">
-      <w:startOverride w:val="1"/>
-    </w:lvlOverride>
-    <w:lvlOverride w:ilvl="2">
-      <w:startOverride w:val="1"/>
-    </w:lvlOverride>
-    <w:lvlOverride w:ilvl="3">
-      <w:startOverride w:val="1"/>
-    </w:lvlOverride>
-    <w:lvlOverride w:ilvl="4">
-      <w:startOverride w:val="1"/>
-    </w:lvlOverride>
-    <w:lvlOverride w:ilvl="5">
-      <w:startOverride w:val="1"/>
-    </w:lvlOverride>
-    <w:lvlOverride w:ilvl="6">
-      <w:startOverride w:val="1"/>
-    </w:lvlOverride>
-    <w:lvlOverride w:ilvl="7">
-      <w:startOverride w:val="1"/>
-    </w:lvlOverride>
-    <w:lvlOverride w:ilvl="8">
-      <w:startOverride w:val="1"/>
-    </w:lvlOverride>
+    <w:abstractNumId w:val="991"/>
   </w:num>
   <w:num w:numId="1020">
     <w:abstractNumId w:val="991"/>
@@ -16194,12 +16572,6 @@
     <w:abstractNumId w:val="991"/>
   </w:num>
   <w:num w:numId="1025">
-    <w:abstractNumId w:val="991"/>
-  </w:num>
-  <w:num w:numId="1026">
-    <w:abstractNumId w:val="991"/>
-  </w:num>
-  <w:num w:numId="1027">
     <w:abstractNumId w:val="99411"/>
     <w:lvlOverride w:ilvl="0">
       <w:startOverride w:val="1"/>
@@ -16229,22 +16601,16 @@
       <w:startOverride w:val="1"/>
     </w:lvlOverride>
   </w:num>
+  <w:num w:numId="1026">
+    <w:abstractNumId w:val="991"/>
+  </w:num>
+  <w:num w:numId="1027">
+    <w:abstractNumId w:val="991"/>
+  </w:num>
   <w:num w:numId="1028">
     <w:abstractNumId w:val="991"/>
   </w:num>
   <w:num w:numId="1029">
-    <w:abstractNumId w:val="991"/>
-  </w:num>
-  <w:num w:numId="1030">
-    <w:abstractNumId w:val="991"/>
-  </w:num>
-  <w:num w:numId="1031">
-    <w:abstractNumId w:val="991"/>
-  </w:num>
-  <w:num w:numId="1032">
-    <w:abstractNumId w:val="991"/>
-  </w:num>
-  <w:num w:numId="1033">
     <w:abstractNumId w:val="99411"/>
     <w:lvlOverride w:ilvl="0">
       <w:startOverride w:val="1"/>
@@ -16274,13 +16640,118 @@
       <w:startOverride w:val="1"/>
     </w:lvlOverride>
   </w:num>
+  <w:num w:numId="1030">
+    <w:abstractNumId w:val="991"/>
+  </w:num>
+  <w:num w:numId="1031">
+    <w:abstractNumId w:val="991"/>
+  </w:num>
+  <w:num w:numId="1032">
+    <w:abstractNumId w:val="991"/>
+  </w:num>
+  <w:num w:numId="1033">
+    <w:abstractNumId w:val="991"/>
+  </w:num>
   <w:num w:numId="1034">
     <w:abstractNumId w:val="991"/>
   </w:num>
   <w:num w:numId="1035">
+    <w:abstractNumId w:val="99411"/>
+    <w:lvlOverride w:ilvl="0">
+      <w:startOverride w:val="1"/>
+    </w:lvlOverride>
+    <w:lvlOverride w:ilvl="1">
+      <w:startOverride w:val="1"/>
+    </w:lvlOverride>
+    <w:lvlOverride w:ilvl="2">
+      <w:startOverride w:val="1"/>
+    </w:lvlOverride>
+    <w:lvlOverride w:ilvl="3">
+      <w:startOverride w:val="1"/>
+    </w:lvlOverride>
+    <w:lvlOverride w:ilvl="4">
+      <w:startOverride w:val="1"/>
+    </w:lvlOverride>
+    <w:lvlOverride w:ilvl="5">
+      <w:startOverride w:val="1"/>
+    </w:lvlOverride>
+    <w:lvlOverride w:ilvl="6">
+      <w:startOverride w:val="1"/>
+    </w:lvlOverride>
+    <w:lvlOverride w:ilvl="7">
+      <w:startOverride w:val="1"/>
+    </w:lvlOverride>
+    <w:lvlOverride w:ilvl="8">
+      <w:startOverride w:val="1"/>
+    </w:lvlOverride>
+  </w:num>
+  <w:num w:numId="1036">
     <w:abstractNumId w:val="991"/>
   </w:num>
-  <w:num w:numId="1036">
+  <w:num w:numId="1037">
+    <w:abstractNumId w:val="991"/>
+  </w:num>
+  <w:num w:numId="1038">
+    <w:abstractNumId w:val="991"/>
+  </w:num>
+  <w:num w:numId="1039">
+    <w:abstractNumId w:val="991"/>
+  </w:num>
+  <w:num w:numId="1040">
+    <w:abstractNumId w:val="991"/>
+  </w:num>
+  <w:num w:numId="1041">
+    <w:abstractNumId w:val="991"/>
+  </w:num>
+  <w:num w:numId="1042">
+    <w:abstractNumId w:val="991"/>
+  </w:num>
+  <w:num w:numId="1043">
+    <w:abstractNumId w:val="991"/>
+  </w:num>
+  <w:num w:numId="1044">
+    <w:abstractNumId w:val="991"/>
+  </w:num>
+  <w:num w:numId="1045">
+    <w:abstractNumId w:val="991"/>
+  </w:num>
+  <w:num w:numId="1046">
+    <w:abstractNumId w:val="991"/>
+  </w:num>
+  <w:num w:numId="1047">
+    <w:abstractNumId w:val="991"/>
+  </w:num>
+  <w:num w:numId="1048">
+    <w:abstractNumId w:val="991"/>
+  </w:num>
+  <w:num w:numId="1049">
+    <w:abstractNumId w:val="991"/>
+  </w:num>
+  <w:num w:numId="1050">
+    <w:abstractNumId w:val="991"/>
+  </w:num>
+  <w:num w:numId="1051">
+    <w:abstractNumId w:val="991"/>
+  </w:num>
+  <w:num w:numId="1052">
+    <w:abstractNumId w:val="991"/>
+  </w:num>
+  <w:num w:numId="1053">
+    <w:abstractNumId w:val="991"/>
+  </w:num>
+  <w:num w:numId="1054">
+    <w:abstractNumId w:val="991"/>
+  </w:num>
+  <w:num w:numId="1055">
+    <w:abstractNumId w:val="991"/>
+  </w:num>
+  <w:num w:numId="1056">
+    <w:abstractNumId w:val="991"/>
+  </w:num>
+  <w:num w:numId="1057">
+    <w:abstractNumId w:val="991"/>
+  </w:num>
+  <w:num w:numId="1058">
     <w:abstractNumId w:val="99411"/>
     <w:lvlOverride w:ilvl="0">
       <w:startOverride w:val="1"/>

</xml_diff>